<commit_message>
Reframe $1 trial as benchmark from another brand (not Numin's own result)
</commit_message>
<xml_diff>
--- a/Numin-Acquisition-Offer-Proposal.docx
+++ b/Numin-Acquisition-Offer-Proposal.docx
@@ -57,7 +57,7 @@
           <w:i w:val="0"/>
           <w:sz w:val="22"/>
         </w:rPr>
-        <w:t>Our cost of goods has dropped from ~90% to ~50% of the subscription price. That one change makes two acquisition offers viable that didn’t pencil before — an email-gated discount we’ve run successfully, and a $1 trial we recently tested that drove very high email volume. Meanwhile our email capture has fallen since the site and price change (opt-in 6.2% → 2.7%, ~750 → ~350 new emails per month), so we need a stronger offer back in market.</w:t>
+        <w:t>Our cost of goods has dropped from ~90% to ~50% of the subscription price. That one change makes two acquisition offers viable that didn’t pencil before — an email-gated discount we’ve run successfully here, and a $1 trial that is new to Numin but proven at a comparable brand, where it drove very high email volume. Meanwhile our email capture has fallen since the site and price change (opt-in 6.2% → 2.7%, ~750 → ~350 new emails per month), so we need a stronger offer back in market.</w:t>
       </w:r>
     </w:p>
     <w:p>
@@ -552,7 +552,7 @@
           <w:i w:val="0"/>
           <w:sz w:val="22"/>
         </w:rPr>
-        <w:t>The customer pays $1 today and gets the product. If they don’t cancel, they’re charged the full price at day 21; their first refill ships at day 30, then monthly after that. “$1” is the strongest hook we have, so it is by far our biggest list-builder.</w:t>
+        <w:t>The customer pays $1 today and gets the product. If they don’t cancel, they’re charged the full price at day 21; the first refill ships at day 30, then monthly after that. This offer is new to Numin — but a $1 hook is about the strongest in DTC, and at a comparable brand it drove very high email volume, so we expect it to be our biggest list-builder.</w:t>
       </w:r>
     </w:p>
     <w:p>
@@ -654,7 +654,7 @@
               <w:rPr>
                 <w:b/>
               </w:rPr>
-              <w:t>~20–33% (we saw 33%)</w:t>
+              <w:t>~20–33% (benchmark: ~33% at a comparable brand)</w:t>
             </w:r>
           </w:p>
         </w:tc>
@@ -1361,7 +1361,7 @@
         <w:spacing w:after="60"/>
       </w:pPr>
       <w:r>
-        <w:t>Confirm with our last $1 campaign’s actual day-21 conversion, reorder rate, and chargebacks before scaling.</w:t>
+        <w:t>Try One Dollar is new to Numin — treat the first run as a measured test: instrument day-21 conversion, reorder rate, and chargebacks, and validate against the benchmark before scaling.</w:t>
       </w:r>
     </w:p>
     <w:p>
@@ -1413,7 +1413,7 @@
           <w:color w:val="6B7178"/>
           <w:sz w:val="20"/>
         </w:rPr>
-        <w:t>Opt-in: Comeback proven at ~6.2%; Try One Dollar observed at 33% on a simpler version, planned here at 20%.</w:t>
+        <w:t>Opt-in: Comeback proven at ~6.2% at Numin; Try One Dollar is new to Numin — the ~33% is a benchmark from a comparable $1 trial at another brand, planned here at 20%.</w:t>
       </w:r>
     </w:p>
     <w:p>
@@ -1439,7 +1439,7 @@
           <w:color w:val="6B7178"/>
           <w:sz w:val="20"/>
         </w:rPr>
-        <w:t>Try One Dollar upside: ~60% day-21 conversion, ~6-month retention, ~$40–50 effective cost per subscriber — optimistic but plausible, not a floor.</w:t>
+        <w:t>Try One Dollar upside: ~60% day-21 conversion, ~6-month retention, ~$40–50 effective cost per subscriber — optimistic but plausible, and unproven at Numin.</w:t>
       </w:r>
     </w:p>
     <w:p>

</xml_diff>

<commit_message>
Rewrite proposal in plain language; update to $90/$54 pricing, ~$27 per order
</commit_message>
<xml_diff>
--- a/Numin-Acquisition-Offer-Proposal.docx
+++ b/Numin-Acquisition-Offer-Proposal.docx
@@ -12,7 +12,7 @@
           <w:color w:val="1F2A37"/>
           <w:sz w:val="44"/>
         </w:rPr>
-        <w:t>Numin — Acquisition Offer Proposal</w:t>
+        <w:t>Numin Offer Plan</w:t>
       </w:r>
     </w:p>
     <w:p>
@@ -24,7 +24,7 @@
           <w:color w:val="6B7178"/>
           <w:sz w:val="21"/>
         </w:rPr>
-        <w:t>Two offers · how each works · unit-economic forecast  —  June 2026</w:t>
+        <w:t>Two offers. What each one is, and the money behind it.  June 2026</w:t>
       </w:r>
     </w:p>
     <w:p>
@@ -45,7 +45,7 @@
           <w:color w:val="1F2A37"/>
           <w:sz w:val="29"/>
         </w:rPr>
-        <w:t>Background</w:t>
+        <w:t>Why now</w:t>
       </w:r>
     </w:p>
     <w:p>
@@ -57,7 +57,31 @@
           <w:i w:val="0"/>
           <w:sz w:val="22"/>
         </w:rPr>
-        <w:t>Our cost of goods has dropped from ~90% to ~50% of the subscription price. That one change makes two acquisition offers viable that didn’t pencil before — an email-gated discount we’ve run successfully here, and a $1 trial that is new to Numin but proven at a comparable brand, where it drove very high email volume. Meanwhile our email capture has fallen since the site and price change (opt-in 6.2% → 2.7%, ~750 → ~350 new emails per month), so we need a stronger offer back in market.</w:t>
+        <w:t>A box of Numin sells for $54 on a monthly plan, or $90 as a one time buy. It now costs us about $27 to make and ship a box. It used to cost about $48. So we keep more money on every box than we used to.</w:t>
+      </w:r>
+    </w:p>
+    <w:p>
+      <w:pPr>
+        <w:spacing w:after="120"/>
+      </w:pPr>
+      <w:r>
+        <w:rPr>
+          <w:i w:val="0"/>
+          <w:sz w:val="22"/>
+        </w:rPr>
+        <w:t>That change matters. Two offers that lost money before can now make money. One is a discount offer. We have run it here before and it worked. It filled our email list. The other is a $1 trial. It is new for Numin. It worked at another brand and brought in a lot of emails.</w:t>
+      </w:r>
+    </w:p>
+    <w:p>
+      <w:pPr>
+        <w:spacing w:after="120"/>
+      </w:pPr>
+      <w:r>
+        <w:rPr>
+          <w:i w:val="0"/>
+          <w:sz w:val="22"/>
+        </w:rPr>
+        <w:t>We also have a problem to fix. Fewer people are joining our email list. Sign ups dropped from 6 out of 100 visitors to under 3 out of 100. New emails dropped from about 750 a month to about 350. We need a stronger offer to turn this around.</w:t>
       </w:r>
     </w:p>
     <w:p>
@@ -70,7 +94,7 @@
           <w:color w:val="1F2A37"/>
           <w:sz w:val="29"/>
         </w:rPr>
-        <w:t>The economics in brief</w:t>
+        <w:t>The basic numbers</w:t>
       </w:r>
     </w:p>
     <w:p>
@@ -82,7 +106,7 @@
         <w:rPr>
           <w:sz w:val="22"/>
         </w:rPr>
-        <w:t>Subscription price: $54 / month (20-pack).</w:t>
+        <w:t>Monthly plan price: $54 for one box.</w:t>
       </w:r>
     </w:p>
     <w:p>
@@ -94,7 +118,7 @@
         <w:rPr>
           <w:sz w:val="22"/>
         </w:rPr>
-        <w:t>Cost to make + ship: ~$27 (50% of price; was ~$49 at 90% COGS).</w:t>
+        <w:t>One time price, no plan: $90.</w:t>
       </w:r>
     </w:p>
     <w:p>
@@ -106,7 +130,7 @@
         <w:rPr>
           <w:sz w:val="22"/>
         </w:rPr>
-        <w:t>Contribution per order: ~$27.</w:t>
+        <w:t>Cost to make and ship one box: about $27.</w:t>
       </w:r>
     </w:p>
     <w:p>
@@ -118,7 +142,7 @@
         <w:rPr>
           <w:sz w:val="22"/>
         </w:rPr>
-        <w:t>Traffic: ~13,000 visitors / month; each 1 point of opt-in ≈ ~130 new emails / month.</w:t>
+        <w:t>Money we keep per box: about $27. We use this to pay for ads and to make a profit.</w:t>
       </w:r>
     </w:p>
     <w:p>
@@ -130,7 +154,19 @@
         <w:rPr>
           <w:sz w:val="22"/>
         </w:rPr>
-        <w:t>Typical retention: ~4 months (the number we most need to confirm).</w:t>
+        <w:t>Visitors to our site: about 13,000 a month.</w:t>
+      </w:r>
+    </w:p>
+    <w:p>
+      <w:pPr>
+        <w:pStyle w:val="ListBullet"/>
+        <w:spacing w:after="40"/>
+      </w:pPr>
+      <w:r>
+        <w:rPr>
+          <w:sz w:val="22"/>
+        </w:rPr>
+        <w:t>How long a customer stays: about 4 months on average. We want this to be longer.</w:t>
       </w:r>
     </w:p>
     <w:p>
@@ -143,7 +179,7 @@
           <w:color w:val="0E7490"/>
           <w:sz w:val="29"/>
         </w:rPr>
-        <w:t>Offer 1 — The Comeback Offer</w:t>
+        <w:t>Offer 1: The Comeback Deal</w:t>
       </w:r>
     </w:p>
     <w:p>
@@ -168,7 +204,31 @@
           <w:i w:val="0"/>
           <w:sz w:val="22"/>
         </w:rPr>
-        <w:t>An inflated “anchor” price shown next to a deep first-order discount that the customer unlocks by entering their email and starting a subscription. This is the offer that filled our email list before. At 90% COGS the discounted first order made about $0; at 50% COGS it makes +$22 — same offer, now profitable from order one.</w:t>
+        <w:t>We show two prices on the site. One box by itself is $90. Or you join the monthly plan and pay $54. That is 40 percent off.</w:t>
+      </w:r>
+    </w:p>
+    <w:p>
+      <w:pPr>
+        <w:spacing w:after="120"/>
+      </w:pPr>
+      <w:r>
+        <w:rPr>
+          <w:i w:val="0"/>
+          <w:sz w:val="22"/>
+        </w:rPr>
+        <w:t>A pop up asks for the customer's email to unlock the plan price. They enter their email. They join the plan. They pay $54 every month.</w:t>
+      </w:r>
+    </w:p>
+    <w:p>
+      <w:pPr>
+        <w:spacing w:after="120"/>
+      </w:pPr>
+      <w:r>
+        <w:rPr>
+          <w:i w:val="0"/>
+          <w:sz w:val="22"/>
+        </w:rPr>
+        <w:t>This is the same offer we used before, and it worked. The reason it lost money back then was simple. The product cost too much to make. Now it costs less, so the offer makes money from the very first order.</w:t>
       </w:r>
     </w:p>
     <w:p>
@@ -181,7 +241,7 @@
           <w:color w:val="1F2A37"/>
           <w:sz w:val="23"/>
         </w:rPr>
-        <w:t>Unit-economic forecast</w:t>
+        <w:t>The money</w:t>
       </w:r>
     </w:p>
     <w:tbl>
@@ -198,7 +258,7 @@
       <w:tr>
         <w:tc>
           <w:tcPr>
-            <w:tcW w:type="dxa" w:w="4176"/>
+            <w:tcW w:type="dxa" w:w="4896"/>
             <w:vAlign w:val="center"/>
             <w:shd w:val="clear" w:color="auto" w:fill="1F2A37"/>
           </w:tcPr>
@@ -212,13 +272,13 @@
                 <w:b/>
                 <w:color w:val="FFFFFF"/>
               </w:rPr>
-              <w:t>Metric</w:t>
+              <w:t>What</w:t>
             </w:r>
           </w:p>
         </w:tc>
         <w:tc>
           <w:tcPr>
-            <w:tcW w:type="dxa" w:w="5328"/>
+            <w:tcW w:type="dxa" w:w="4608"/>
             <w:vAlign w:val="center"/>
             <w:shd w:val="clear" w:color="auto" w:fill="1F2A37"/>
           </w:tcPr>
@@ -232,7 +292,7 @@
                 <w:b/>
                 <w:color w:val="FFFFFF"/>
               </w:rPr>
-              <w:t>Forecast</w:t>
+              <w:t>Number</w:t>
             </w:r>
           </w:p>
         </w:tc>
@@ -240,7 +300,7 @@
       <w:tr>
         <w:tc>
           <w:tcPr>
-            <w:tcW w:type="dxa" w:w="4176"/>
+            <w:tcW w:type="dxa" w:w="4896"/>
             <w:vAlign w:val="center"/>
           </w:tcPr>
           <w:p>
@@ -252,13 +312,13 @@
               <w:rPr>
                 <w:b w:val="0"/>
               </w:rPr>
-              <w:t>Email opt-in rate</w:t>
+              <w:t>People who join our email list</w:t>
             </w:r>
           </w:p>
         </w:tc>
         <w:tc>
           <w:tcPr>
-            <w:tcW w:type="dxa" w:w="5328"/>
+            <w:tcW w:type="dxa" w:w="4608"/>
             <w:vAlign w:val="center"/>
           </w:tcPr>
           <w:p>
@@ -270,7 +330,7 @@
               <w:rPr>
                 <w:b/>
               </w:rPr>
-              <w:t>~6% (proven; was 6.2%)</w:t>
+              <w:t>about 6 out of 100 visitors</w:t>
             </w:r>
           </w:p>
         </w:tc>
@@ -278,7 +338,7 @@
       <w:tr>
         <w:tc>
           <w:tcPr>
-            <w:tcW w:type="dxa" w:w="4176"/>
+            <w:tcW w:type="dxa" w:w="4896"/>
             <w:vAlign w:val="center"/>
           </w:tcPr>
           <w:p>
@@ -290,13 +350,13 @@
               <w:rPr>
                 <w:b w:val="0"/>
               </w:rPr>
-              <w:t>New emails / month</w:t>
+              <w:t>New emails each month</w:t>
             </w:r>
           </w:p>
         </w:tc>
         <w:tc>
           <w:tcPr>
-            <w:tcW w:type="dxa" w:w="5328"/>
+            <w:tcW w:type="dxa" w:w="4608"/>
             <w:vAlign w:val="center"/>
           </w:tcPr>
           <w:p>
@@ -308,7 +368,7 @@
               <w:rPr>
                 <w:b/>
               </w:rPr>
-              <w:t>~650–910</w:t>
+              <w:t>about 650 to 910</w:t>
             </w:r>
           </w:p>
         </w:tc>
@@ -316,7 +376,7 @@
       <w:tr>
         <w:tc>
           <w:tcPr>
-            <w:tcW w:type="dxa" w:w="4176"/>
+            <w:tcW w:type="dxa" w:w="4896"/>
             <w:vAlign w:val="center"/>
           </w:tcPr>
           <w:p>
@@ -328,13 +388,13 @@
               <w:rPr>
                 <w:b w:val="0"/>
               </w:rPr>
-              <w:t>First order (discounted ~$49)</w:t>
+              <w:t>Money we keep on every order</w:t>
             </w:r>
           </w:p>
         </w:tc>
         <w:tc>
           <w:tcPr>
-            <w:tcW w:type="dxa" w:w="5328"/>
+            <w:tcW w:type="dxa" w:w="4608"/>
             <w:vAlign w:val="center"/>
           </w:tcPr>
           <w:p>
@@ -346,7 +406,7 @@
               <w:rPr>
                 <w:b/>
               </w:rPr>
-              <w:t>+$22 contribution</w:t>
+              <w:t>about $27</w:t>
             </w:r>
           </w:p>
         </w:tc>
@@ -354,7 +414,7 @@
       <w:tr>
         <w:tc>
           <w:tcPr>
-            <w:tcW w:type="dxa" w:w="4176"/>
+            <w:tcW w:type="dxa" w:w="4896"/>
             <w:vAlign w:val="center"/>
           </w:tcPr>
           <w:p>
@@ -366,13 +426,13 @@
               <w:rPr>
                 <w:b w:val="0"/>
               </w:rPr>
-              <w:t>Each refill ($54)</w:t>
+              <w:t>If an ad costs $50 to get a customer</w:t>
             </w:r>
           </w:p>
         </w:tc>
         <w:tc>
           <w:tcPr>
-            <w:tcW w:type="dxa" w:w="5328"/>
+            <w:tcW w:type="dxa" w:w="4608"/>
             <w:vAlign w:val="center"/>
           </w:tcPr>
           <w:p>
@@ -384,7 +444,7 @@
               <w:rPr>
                 <w:b/>
               </w:rPr>
-              <w:t>+$27 contribution</w:t>
+              <w:t>paid back in about 2 months, then profit</w:t>
             </w:r>
           </w:p>
         </w:tc>
@@ -392,7 +452,7 @@
       <w:tr>
         <w:tc>
           <w:tcPr>
-            <w:tcW w:type="dxa" w:w="4176"/>
+            <w:tcW w:type="dxa" w:w="4896"/>
             <w:vAlign w:val="center"/>
           </w:tcPr>
           <w:p>
@@ -404,13 +464,13 @@
               <w:rPr>
                 <w:b w:val="0"/>
               </w:rPr>
-              <w:t>Payback @ $50 CAC</w:t>
+              <w:t>If an ad costs $100 to get a customer</w:t>
             </w:r>
           </w:p>
         </w:tc>
         <w:tc>
           <w:tcPr>
-            <w:tcW w:type="dxa" w:w="5328"/>
+            <w:tcW w:type="dxa" w:w="4608"/>
             <w:vAlign w:val="center"/>
           </w:tcPr>
           <w:p>
@@ -422,7 +482,7 @@
               <w:rPr>
                 <w:b/>
               </w:rPr>
-              <w:t>~2 months  ·  2.1× LTV:CAC</w:t>
+              <w:t>paid back in about 4 months, so we just break even</w:t>
             </w:r>
           </w:p>
         </w:tc>
@@ -430,45 +490,7 @@
       <w:tr>
         <w:tc>
           <w:tcPr>
-            <w:tcW w:type="dxa" w:w="4176"/>
-            <w:vAlign w:val="center"/>
-          </w:tcPr>
-          <w:p>
-            <w:pPr>
-              <w:spacing w:after="40" w:before="40"/>
-            </w:pPr>
-            <w:r/>
-            <w:r>
-              <w:rPr>
-                <w:b w:val="0"/>
-              </w:rPr>
-              <w:t>Payback @ $100 CAC</w:t>
-            </w:r>
-          </w:p>
-        </w:tc>
-        <w:tc>
-          <w:tcPr>
-            <w:tcW w:type="dxa" w:w="5328"/>
-            <w:vAlign w:val="center"/>
-          </w:tcPr>
-          <w:p>
-            <w:pPr>
-              <w:spacing w:after="40" w:before="40"/>
-            </w:pPr>
-            <w:r/>
-            <w:r>
-              <w:rPr>
-                <w:b/>
-              </w:rPr>
-              <w:t>~4 months  ·  1.0× (break-even)</w:t>
-            </w:r>
-          </w:p>
-        </w:tc>
-      </w:tr>
-      <w:tr>
-        <w:tc>
-          <w:tcPr>
-            <w:tcW w:type="dxa" w:w="4176"/>
+            <w:tcW w:type="dxa" w:w="4896"/>
             <w:vAlign w:val="center"/>
           </w:tcPr>
           <w:p>
@@ -486,7 +508,7 @@
         </w:tc>
         <w:tc>
           <w:tcPr>
-            <w:tcW w:type="dxa" w:w="5328"/>
+            <w:tcW w:type="dxa" w:w="4608"/>
             <w:vAlign w:val="center"/>
           </w:tcPr>
           <w:p>
@@ -498,7 +520,7 @@
               <w:rPr>
                 <w:b/>
               </w:rPr>
-              <w:t>Low — profitable on the first order</w:t>
+              <w:t>Low. We make money on the first order.</w:t>
             </w:r>
           </w:p>
         </w:tc>
@@ -514,7 +536,7 @@
           <w:color w:val="6B7178"/>
           <w:sz w:val="21"/>
         </w:rPr>
-        <w:t>Takeaway: a low-risk engine that rebuilds the email list and makes money on the first order, before we count on anyone staying.</w:t>
+        <w:t>In short: this is the safe choice. It makes money right away and rebuilds the email list.</w:t>
       </w:r>
     </w:p>
     <w:p>
@@ -527,7 +549,7 @@
           <w:color w:val="0E7490"/>
           <w:sz w:val="29"/>
         </w:rPr>
-        <w:t>Offer 2 — Try One Dollar</w:t>
+        <w:t>Offer 2: The $1 Trial</w:t>
       </w:r>
     </w:p>
     <w:p>
@@ -552,7 +574,19 @@
           <w:i w:val="0"/>
           <w:sz w:val="22"/>
         </w:rPr>
-        <w:t>The customer pays $1 today and gets the product. If they don’t cancel, they’re charged the full price at day 21; the first refill ships at day 30, then monthly after that. This offer is new to Numin — but a $1 hook is about the strongest in DTC, and at a comparable brand it drove very high email volume, so we expect it to be our biggest list-builder.</w:t>
+        <w:t>The customer pays $1 today and gets a box. If they do not cancel, we charge them the full price on day 21. On day 30 we send the next box and the monthly plan begins.</w:t>
+      </w:r>
+    </w:p>
+    <w:p>
+      <w:pPr>
+        <w:spacing w:after="120"/>
+      </w:pPr>
+      <w:r>
+        <w:rPr>
+          <w:i w:val="0"/>
+          <w:sz w:val="22"/>
+        </w:rPr>
+        <w:t>This offer is new for Numin. A $1 price is the strongest hook there is. At another brand it brought in far more emails than a normal offer. So we expect it to bring in the most emails by far.</w:t>
       </w:r>
     </w:p>
     <w:p>
@@ -565,7 +599,7 @@
           <w:color w:val="1F2A37"/>
           <w:sz w:val="23"/>
         </w:rPr>
-        <w:t>Unit-economic forecast</w:t>
+        <w:t>The money</w:t>
       </w:r>
     </w:p>
     <w:tbl>
@@ -582,7 +616,7 @@
       <w:tr>
         <w:tc>
           <w:tcPr>
-            <w:tcW w:type="dxa" w:w="4176"/>
+            <w:tcW w:type="dxa" w:w="4896"/>
             <w:vAlign w:val="center"/>
             <w:shd w:val="clear" w:color="auto" w:fill="1F2A37"/>
           </w:tcPr>
@@ -596,13 +630,13 @@
                 <w:b/>
                 <w:color w:val="FFFFFF"/>
               </w:rPr>
-              <w:t>Metric</w:t>
+              <w:t>What</w:t>
             </w:r>
           </w:p>
         </w:tc>
         <w:tc>
           <w:tcPr>
-            <w:tcW w:type="dxa" w:w="5328"/>
+            <w:tcW w:type="dxa" w:w="4608"/>
             <w:vAlign w:val="center"/>
             <w:shd w:val="clear" w:color="auto" w:fill="1F2A37"/>
           </w:tcPr>
@@ -616,7 +650,7 @@
                 <w:b/>
                 <w:color w:val="FFFFFF"/>
               </w:rPr>
-              <w:t>Forecast</w:t>
+              <w:t>Number</w:t>
             </w:r>
           </w:p>
         </w:tc>
@@ -624,7 +658,7 @@
       <w:tr>
         <w:tc>
           <w:tcPr>
-            <w:tcW w:type="dxa" w:w="4176"/>
+            <w:tcW w:type="dxa" w:w="4896"/>
             <w:vAlign w:val="center"/>
           </w:tcPr>
           <w:p>
@@ -636,13 +670,13 @@
               <w:rPr>
                 <w:b w:val="0"/>
               </w:rPr>
-              <w:t>Email opt-in rate</w:t>
+              <w:t>People who join our email list</w:t>
             </w:r>
           </w:p>
         </w:tc>
         <w:tc>
           <w:tcPr>
-            <w:tcW w:type="dxa" w:w="5328"/>
+            <w:tcW w:type="dxa" w:w="4608"/>
             <w:vAlign w:val="center"/>
           </w:tcPr>
           <w:p>
@@ -654,7 +688,7 @@
               <w:rPr>
                 <w:b/>
               </w:rPr>
-              <w:t>~20–33% (benchmark: ~33% at a comparable brand)</w:t>
+              <w:t>about 20 out of 100 (another brand got 33)</w:t>
             </w:r>
           </w:p>
         </w:tc>
@@ -662,7 +696,7 @@
       <w:tr>
         <w:tc>
           <w:tcPr>
-            <w:tcW w:type="dxa" w:w="4176"/>
+            <w:tcW w:type="dxa" w:w="4896"/>
             <w:vAlign w:val="center"/>
           </w:tcPr>
           <w:p>
@@ -674,13 +708,13 @@
               <w:rPr>
                 <w:b w:val="0"/>
               </w:rPr>
-              <w:t>New emails / month</w:t>
+              <w:t>New emails each month</w:t>
             </w:r>
           </w:p>
         </w:tc>
         <w:tc>
           <w:tcPr>
-            <w:tcW w:type="dxa" w:w="5328"/>
+            <w:tcW w:type="dxa" w:w="4608"/>
             <w:vAlign w:val="center"/>
           </w:tcPr>
           <w:p>
@@ -692,7 +726,7 @@
               <w:rPr>
                 <w:b/>
               </w:rPr>
-              <w:t>~2,600–4,300 (~7× today)</w:t>
+              <w:t>about 2,600 to 4,300, around 7 times what we get now</w:t>
             </w:r>
           </w:p>
         </w:tc>
@@ -700,7 +734,7 @@
       <w:tr>
         <w:tc>
           <w:tcPr>
-            <w:tcW w:type="dxa" w:w="4176"/>
+            <w:tcW w:type="dxa" w:w="4896"/>
             <w:vAlign w:val="center"/>
           </w:tcPr>
           <w:p>
@@ -712,13 +746,13 @@
               <w:rPr>
                 <w:b w:val="0"/>
               </w:rPr>
-              <w:t>First-order contribution</w:t>
+              <w:t>Money we keep on the first order</w:t>
             </w:r>
           </w:p>
         </w:tc>
         <w:tc>
           <w:tcPr>
-            <w:tcW w:type="dxa" w:w="5328"/>
+            <w:tcW w:type="dxa" w:w="4608"/>
             <w:vAlign w:val="center"/>
           </w:tcPr>
           <w:p>
@@ -730,7 +764,7 @@
               <w:rPr>
                 <w:b/>
               </w:rPr>
-              <w:t>~$3–6 (thin)</w:t>
+              <w:t>only about $3 to $6</w:t>
             </w:r>
           </w:p>
         </w:tc>
@@ -738,7 +772,7 @@
       <w:tr>
         <w:tc>
           <w:tcPr>
-            <w:tcW w:type="dxa" w:w="4176"/>
+            <w:tcW w:type="dxa" w:w="4896"/>
             <w:vAlign w:val="center"/>
           </w:tcPr>
           <w:p>
@@ -750,13 +784,13 @@
               <w:rPr>
                 <w:b w:val="0"/>
               </w:rPr>
-              <w:t>Converted subscriber value</w:t>
+              <w:t>Worth of a customer who stays 4 months</w:t>
             </w:r>
           </w:p>
         </w:tc>
         <w:tc>
           <w:tcPr>
-            <w:tcW w:type="dxa" w:w="5328"/>
+            <w:tcW w:type="dxa" w:w="4608"/>
             <w:vAlign w:val="center"/>
           </w:tcPr>
           <w:p>
@@ -768,7 +802,7 @@
               <w:rPr>
                 <w:b/>
               </w:rPr>
-              <w:t>$108 (4 mo) · $162 (6 mo) · $324 (12 mo)</w:t>
+              <w:t>about $108</w:t>
             </w:r>
           </w:p>
         </w:tc>
@@ -776,7 +810,7 @@
       <w:tr>
         <w:tc>
           <w:tcPr>
-            <w:tcW w:type="dxa" w:w="4176"/>
+            <w:tcW w:type="dxa" w:w="4896"/>
             <w:vAlign w:val="center"/>
           </w:tcPr>
           <w:p>
@@ -788,13 +822,13 @@
               <w:rPr>
                 <w:b w:val="0"/>
               </w:rPr>
-              <w:t>Monthly converted cohort</w:t>
+              <w:t>Worth of a customer who stays 6 months</w:t>
             </w:r>
           </w:p>
         </w:tc>
         <w:tc>
           <w:tcPr>
-            <w:tcW w:type="dxa" w:w="5328"/>
+            <w:tcW w:type="dxa" w:w="4608"/>
             <w:vAlign w:val="center"/>
           </w:tcPr>
           <w:p>
@@ -806,7 +840,7 @@
               <w:rPr>
                 <w:b/>
               </w:rPr>
-              <w:t>~780 subs ≈ ~$125K lifetime contribution</w:t>
+              <w:t>about $162</w:t>
             </w:r>
           </w:p>
         </w:tc>
@@ -814,45 +848,7 @@
       <w:tr>
         <w:tc>
           <w:tcPr>
-            <w:tcW w:type="dxa" w:w="4176"/>
-            <w:vAlign w:val="center"/>
-          </w:tcPr>
-          <w:p>
-            <w:pPr>
-              <w:spacing w:after="40" w:before="40"/>
-            </w:pPr>
-            <w:r/>
-            <w:r>
-              <w:rPr>
-                <w:b w:val="0"/>
-              </w:rPr>
-              <w:t>LTV:CAC (upside)</w:t>
-            </w:r>
-          </w:p>
-        </w:tc>
-        <w:tc>
-          <w:tcPr>
-            <w:tcW w:type="dxa" w:w="5328"/>
-            <w:vAlign w:val="center"/>
-          </w:tcPr>
-          <w:p>
-            <w:pPr>
-              <w:spacing w:after="40" w:before="40"/>
-            </w:pPr>
-            <w:r/>
-            <w:r>
-              <w:rPr>
-                <w:b/>
-              </w:rPr>
-              <w:t>~3–4× @ $40–50 CAC, 6-mo life</w:t>
-            </w:r>
-          </w:p>
-        </w:tc>
-      </w:tr>
-      <w:tr>
-        <w:tc>
-          <w:tcPr>
-            <w:tcW w:type="dxa" w:w="4176"/>
+            <w:tcW w:type="dxa" w:w="4896"/>
             <w:vAlign w:val="center"/>
           </w:tcPr>
           <w:p>
@@ -870,7 +866,7 @@
         </w:tc>
         <w:tc>
           <w:tcPr>
-            <w:tcW w:type="dxa" w:w="5328"/>
+            <w:tcW w:type="dxa" w:w="4608"/>
             <w:vAlign w:val="center"/>
           </w:tcPr>
           <w:p>
@@ -882,7 +878,7 @@
               <w:rPr>
                 <w:b/>
               </w:rPr>
-              <w:t>High — the return rides on refills</w:t>
+              <w:t>High. The money comes from people staying, not the first order.</w:t>
             </w:r>
           </w:p>
         </w:tc>
@@ -890,15 +886,63 @@
     </w:tbl>
     <w:p>
       <w:pPr>
-        <w:spacing w:after="120"/>
+        <w:spacing w:before="160" w:after="40"/>
       </w:pPr>
       <w:r>
         <w:rPr>
-          <w:i/>
-          <w:color w:val="6B7178"/>
-          <w:sz w:val="21"/>
+          <w:b/>
+          <w:color w:val="1F2A37"/>
+          <w:sz w:val="23"/>
         </w:rPr>
-        <w:t>The catch: profitable only if at least ~49% of trials convert at day 21 (healthy ≥55%), customers stay for refills, and chargebacks stay under 1% (clear disclosure, a reminder before the day-21 charge, one-click cancel).</w:t>
+        <w:t>The catch</w:t>
+      </w:r>
+    </w:p>
+    <w:p>
+      <w:pPr>
+        <w:spacing w:after="40"/>
+      </w:pPr>
+      <w:r>
+        <w:rPr>
+          <w:i w:val="0"/>
+          <w:sz w:val="22"/>
+        </w:rPr>
+        <w:t>This offer only works if people stay. Here is what has to be true:</w:t>
+      </w:r>
+    </w:p>
+    <w:p>
+      <w:pPr>
+        <w:pStyle w:val="ListBullet"/>
+        <w:spacing w:after="40"/>
+      </w:pPr>
+      <w:r>
+        <w:rPr>
+          <w:sz w:val="22"/>
+        </w:rPr>
+        <w:t>About half the people need to keep the product on day 21. If fewer stay, we lose money.</w:t>
+      </w:r>
+    </w:p>
+    <w:p>
+      <w:pPr>
+        <w:pStyle w:val="ListBullet"/>
+        <w:spacing w:after="40"/>
+      </w:pPr>
+      <w:r>
+        <w:rPr>
+          <w:sz w:val="22"/>
+        </w:rPr>
+        <w:t>A person who takes the $1 deal and then leaves costs us about $26.</w:t>
+      </w:r>
+    </w:p>
+    <w:p>
+      <w:pPr>
+        <w:pStyle w:val="ListBullet"/>
+        <w:spacing w:after="40"/>
+      </w:pPr>
+      <w:r>
+        <w:rPr>
+          <w:sz w:val="22"/>
+        </w:rPr>
+        <w:t>We must keep refunds and card disputes low, under 1 out of 100. The day 21 charge can surprise people, so we tell them up front, remind them before we charge, and make canceling easy.</w:t>
       </w:r>
     </w:p>
     <w:p>
@@ -911,7 +955,7 @@
           <w:color w:val="1F2A37"/>
           <w:sz w:val="29"/>
         </w:rPr>
-        <w:t>Side by side</w:t>
+        <w:t>The two offers side by side</w:t>
       </w:r>
     </w:p>
     <w:tbl>
@@ -962,7 +1006,7 @@
                 <w:b/>
                 <w:color w:val="FFFFFF"/>
               </w:rPr>
-              <w:t>Comeback Offer</w:t>
+              <w:t>The Comeback Deal</w:t>
             </w:r>
           </w:p>
         </w:tc>
@@ -982,7 +1026,7 @@
                 <w:b/>
                 <w:color w:val="FFFFFF"/>
               </w:rPr>
-              <w:t>Try One Dollar</w:t>
+              <w:t>The $1 Trial</w:t>
             </w:r>
           </w:p>
         </w:tc>
@@ -1002,7 +1046,7 @@
               <w:rPr>
                 <w:b/>
               </w:rPr>
-              <w:t>New emails / month</w:t>
+              <w:t>New emails each month</w:t>
             </w:r>
           </w:p>
         </w:tc>
@@ -1020,7 +1064,7 @@
               <w:rPr>
                 <w:b w:val="0"/>
               </w:rPr>
-              <w:t>650–910</w:t>
+              <w:t>650 to 910</w:t>
             </w:r>
           </w:p>
         </w:tc>
@@ -1038,7 +1082,7 @@
               <w:rPr>
                 <w:b w:val="0"/>
               </w:rPr>
-              <w:t>2,600–4,300</w:t>
+              <w:t>2,600 to 4,300</w:t>
             </w:r>
           </w:p>
         </w:tc>
@@ -1058,7 +1102,7 @@
               <w:rPr>
                 <w:b/>
               </w:rPr>
-              <w:t>First-order contribution</w:t>
+              <w:t>Money on the first order</w:t>
             </w:r>
           </w:p>
         </w:tc>
@@ -1076,7 +1120,7 @@
               <w:rPr>
                 <w:b w:val="0"/>
               </w:rPr>
-              <w:t>+$22</w:t>
+              <w:t>about $27</w:t>
             </w:r>
           </w:p>
         </w:tc>
@@ -1094,7 +1138,7 @@
               <w:rPr>
                 <w:b w:val="0"/>
               </w:rPr>
-              <w:t>~$3–6</w:t>
+              <w:t>about $3 to $6</w:t>
             </w:r>
           </w:p>
         </w:tc>
@@ -1114,7 +1158,7 @@
               <w:rPr>
                 <w:b/>
               </w:rPr>
-              <w:t>Pays back on order 1</w:t>
+              <w:t>Makes money on the first order</w:t>
             </w:r>
           </w:p>
         </w:tc>
@@ -1132,7 +1176,7 @@
               <w:rPr>
                 <w:b w:val="0"/>
               </w:rPr>
-              <w:t>Yes (reasonable CAC)</w:t>
+              <w:t>Yes</w:t>
             </w:r>
           </w:p>
         </w:tc>
@@ -1150,7 +1194,7 @@
               <w:rPr>
                 <w:b w:val="0"/>
               </w:rPr>
-              <w:t>No — refill bet</w:t>
+              <w:t>No. It needs reorders.</w:t>
             </w:r>
           </w:p>
         </w:tc>
@@ -1170,7 +1214,7 @@
               <w:rPr>
                 <w:b/>
               </w:rPr>
-              <w:t>Lifetime value / retained sub</w:t>
+              <w:t>Worth of a customer (6 months)</w:t>
             </w:r>
           </w:p>
         </w:tc>
@@ -1188,7 +1232,7 @@
               <w:rPr>
                 <w:b w:val="0"/>
               </w:rPr>
-              <w:t>~$162 (6 mo)</w:t>
+              <w:t>about $162</w:t>
             </w:r>
           </w:p>
         </w:tc>
@@ -1206,7 +1250,7 @@
               <w:rPr>
                 <w:b w:val="0"/>
               </w:rPr>
-              <w:t>~$162 (6 mo)</w:t>
+              <w:t>about $162</w:t>
             </w:r>
           </w:p>
         </w:tc>
@@ -1300,7 +1344,7 @@
               <w:rPr>
                 <w:b w:val="0"/>
               </w:rPr>
-              <w:t>Steady, profitable list growth</w:t>
+              <w:t>Steady, safe growth</w:t>
             </w:r>
           </w:p>
         </w:tc>
@@ -1318,7 +1362,7 @@
               <w:rPr>
                 <w:b w:val="0"/>
               </w:rPr>
-              <w:t>Aggressive volume</w:t>
+              <w:t>A lot of emails fast</w:t>
             </w:r>
           </w:p>
         </w:tc>
@@ -1334,7 +1378,7 @@
           <w:color w:val="1F2A37"/>
           <w:sz w:val="29"/>
         </w:rPr>
-        <w:t>Recommendation</w:t>
+        <w:t>What we should do</w:t>
       </w:r>
     </w:p>
     <w:p>
@@ -1343,7 +1387,7 @@
         <w:spacing w:after="60"/>
       </w:pPr>
       <w:r>
-        <w:t>Run the Comeback Offer now — low risk, profitable on the first order, and it rebuilds the list we’ve lost.</w:t>
+        <w:t>Start the Comeback Deal now. It is low risk. It makes money on the first order. It rebuilds the email list we lost.</w:t>
       </w:r>
     </w:p>
     <w:p>
@@ -1352,7 +1396,7 @@
         <w:spacing w:after="60"/>
       </w:pPr>
       <w:r>
-        <w:t>Test Try One Dollar on a portion of traffic with the guardrails above; scale only if day-21 conversion and reorder rates clear the bar.</w:t>
+        <w:t>Test the $1 Trial on a small part of our traffic. Watch it closely. Only grow it if enough people stay after day 21 and refunds stay low.</w:t>
       </w:r>
     </w:p>
     <w:p>
@@ -1361,7 +1405,7 @@
         <w:spacing w:after="60"/>
       </w:pPr>
       <w:r>
-        <w:t>Try One Dollar is new to Numin — treat the first run as a measured test: instrument day-21 conversion, reorder rate, and chargebacks, and validate against the benchmark before scaling.</w:t>
+        <w:t>The $1 Trial is new for us, so we do not have our own numbers yet. Treat the first run as a test. Track how many people stay, how many reorder, and how many ask for refunds.</w:t>
       </w:r>
     </w:p>
     <w:p>
@@ -1374,20 +1418,7 @@
           <w:color w:val="1F2A37"/>
           <w:sz w:val="29"/>
         </w:rPr>
-        <w:t>Assumptions &amp; notes</w:t>
-      </w:r>
-    </w:p>
-    <w:p>
-      <w:pPr>
-        <w:spacing w:after="40"/>
-      </w:pPr>
-      <w:r>
-        <w:rPr>
-          <w:i w:val="0"/>
-          <w:color w:val="6B7178"/>
-          <w:sz w:val="20"/>
-        </w:rPr>
-        <w:t>Estimates for planning, not measured results — the low end of each range is the conservative number.</w:t>
+        <w:t>What these numbers are based on</w:t>
       </w:r>
     </w:p>
     <w:p>
@@ -1400,7 +1431,7 @@
           <w:color w:val="6B7178"/>
           <w:sz w:val="20"/>
         </w:rPr>
-        <w:t>$54 sub, ~50% COGS, ~13,000 visitors/mo, ~4-month retention — to be confirmed.</w:t>
+        <w:t>These are estimates for planning. They are not final results. We will confirm them when we run the offers.</w:t>
       </w:r>
     </w:p>
     <w:p>
@@ -1413,7 +1444,7 @@
           <w:color w:val="6B7178"/>
           <w:sz w:val="20"/>
         </w:rPr>
-        <w:t>Opt-in: Comeback proven at ~6.2% at Numin; Try One Dollar is new to Numin — the ~33% is a benchmark from a comparable $1 trial at another brand, planned here at 20%.</w:t>
+        <w:t>A box is $54 on the monthly plan and $90 one time. It costs about $27 to make and ship.</w:t>
       </w:r>
     </w:p>
     <w:p>
@@ -1426,7 +1457,7 @@
           <w:color w:val="6B7178"/>
           <w:sz w:val="20"/>
         </w:rPr>
-        <w:t>Comeback payback: first order +$22, each refill +$27; CAC $50 (target) and $100 (high end we’ve seen).</w:t>
+        <w:t>About 13,000 visitors a month. A typical customer stays about 4 months.</w:t>
       </w:r>
     </w:p>
     <w:p>
@@ -1439,7 +1470,7 @@
           <w:color w:val="6B7178"/>
           <w:sz w:val="20"/>
         </w:rPr>
-        <w:t>Try One Dollar upside: ~60% day-21 conversion, ~6-month retention, ~$40–50 effective cost per subscriber — optimistic but plausible, and unproven at Numin.</w:t>
+        <w:t>The Comeback Deal got about 6 out of 100 sign ups here before.</w:t>
       </w:r>
     </w:p>
     <w:p>
@@ -1452,7 +1483,20 @@
           <w:color w:val="6B7178"/>
           <w:sz w:val="20"/>
         </w:rPr>
-        <w:t>“First-order basis” deliberately ignores future refills, to show the risk before we bet on retention.</w:t>
+        <w:t>The $1 Trial is new to Numin. The 33 out of 100 number is from another brand. We planned with 20 to be safe.</w:t>
+      </w:r>
+    </w:p>
+    <w:p>
+      <w:pPr>
+        <w:pStyle w:val="ListBullet"/>
+        <w:spacing w:after="40"/>
+      </w:pPr>
+      <w:r>
+        <w:rPr>
+          <w:color w:val="6B7178"/>
+          <w:sz w:val="20"/>
+        </w:rPr>
+        <w:t>Customer worth: about $108 if they stay 4 months, $162 for 6 months, $324 for a full year. Most do not stay a full year yet.</w:t>
       </w:r>
     </w:p>
     <w:sectPr>

</xml_diff>

<commit_message>
Add CAC expectations, $1 trial landing-page test plan, quiz proposal; frame $90 as proposed
</commit_message>
<xml_diff>
--- a/Numin-Acquisition-Offer-Proposal.docx
+++ b/Numin-Acquisition-Offer-Proposal.docx
@@ -24,7 +24,7 @@
           <w:color w:val="6B7178"/>
           <w:sz w:val="21"/>
         </w:rPr>
-        <w:t>Two offers. What each one is, and the money behind it.  June 2026</w:t>
+        <w:t>Three proposals. What each one is, and the money behind it.  June 2026</w:t>
       </w:r>
     </w:p>
     <w:p>
@@ -57,7 +57,7 @@
           <w:i w:val="0"/>
           <w:sz w:val="22"/>
         </w:rPr>
-        <w:t>A box of Numin sells for $54 on a monthly plan, or $90 as a one time buy. It now costs us about $27 to make and ship a box. It used to cost about $48. So we keep more money on every box than we used to.</w:t>
+        <w:t>A box of Numin sells for $54 a box on the monthly plan, or $60 as a one time buy. It now costs us about $27 to make and ship a box. It used to cost about $48. So we keep more money on every box than we used to. That change opens the door for offers that lost money before.</w:t>
       </w:r>
     </w:p>
     <w:p>
@@ -69,7 +69,7 @@
           <w:i w:val="0"/>
           <w:sz w:val="22"/>
         </w:rPr>
-        <w:t>That change matters. Two offers that lost money before can now make money. One is a discount offer. We have run it here before and it worked. It filled our email list. The other is a $1 trial. It is new for Numin. It worked at another brand and brought in a lot of emails.</w:t>
+        <w:t>We have two problems to fix.</w:t>
       </w:r>
     </w:p>
     <w:p>
@@ -81,7 +81,31 @@
           <w:i w:val="0"/>
           <w:sz w:val="22"/>
         </w:rPr>
-        <w:t>We also have a problem to fix. Fewer people are joining our email list. Sign ups dropped from 6 out of 100 visitors to under 3 out of 100. New emails dropped from about 750 a month to about 350. We need a stronger offer to turn this around.</w:t>
+        <w:t>First, fewer people are joining our email list. Sign ups dropped from 6 out of 100 visitors to under 3 out of 100. New emails dropped from about 750 a month to about 350.</w:t>
+      </w:r>
+    </w:p>
+    <w:p>
+      <w:pPr>
+        <w:spacing w:after="120"/>
+      </w:pPr>
+      <w:r>
+        <w:rPr>
+          <w:i w:val="0"/>
+          <w:sz w:val="22"/>
+        </w:rPr>
+        <w:t>Second, ads cost too much. Right now it costs us about $143 in ads to get one customer. Some months it was over $200. A customer is only worth about $108 to $162 to us. So we often pay more for a customer than they are worth.</w:t>
+      </w:r>
+    </w:p>
+    <w:p>
+      <w:pPr>
+        <w:spacing w:after="120"/>
+      </w:pPr>
+      <w:r>
+        <w:rPr>
+          <w:i w:val="0"/>
+          <w:sz w:val="22"/>
+        </w:rPr>
+        <w:t>This plan has three proposals to fix both problems. A discount offer we have run before. A $1 trial that is new for us. And a quiz that collects emails without giving any discount.</w:t>
       </w:r>
     </w:p>
     <w:p>
@@ -94,7 +118,7 @@
           <w:color w:val="1F2A37"/>
           <w:sz w:val="29"/>
         </w:rPr>
-        <w:t>The basic numbers</w:t>
+        <w:t>The basic numbers today</w:t>
       </w:r>
     </w:p>
     <w:p>
@@ -118,7 +142,7 @@
         <w:rPr>
           <w:sz w:val="22"/>
         </w:rPr>
-        <w:t>One time price, no plan: $90.</w:t>
+        <w:t>One time price: $60 today. Proposal 1 would change this. See below.</w:t>
       </w:r>
     </w:p>
     <w:p>
@@ -142,7 +166,7 @@
         <w:rPr>
           <w:sz w:val="22"/>
         </w:rPr>
-        <w:t>Money we keep per box: about $27. We use this to pay for ads and to make a profit.</w:t>
+        <w:t>Money we keep per plan order: about $27. This pays for ads and profit.</w:t>
       </w:r>
     </w:p>
     <w:p>
@@ -166,7 +190,289 @@
         <w:rPr>
           <w:sz w:val="22"/>
         </w:rPr>
-        <w:t>How long a customer stays: about 4 months on average. We want this to be longer.</w:t>
+        <w:t>How long a customer stays: about 4 months on average.</w:t>
+      </w:r>
+    </w:p>
+    <w:p>
+      <w:pPr>
+        <w:spacing w:before="280" w:after="80"/>
+      </w:pPr>
+      <w:r>
+        <w:rPr>
+          <w:b/>
+          <w:color w:val="1F2A37"/>
+          <w:sz w:val="29"/>
+        </w:rPr>
+        <w:t>What a customer should cost in ads</w:t>
+      </w:r>
+    </w:p>
+    <w:p>
+      <w:pPr>
+        <w:spacing w:after="120"/>
+      </w:pPr>
+      <w:r>
+        <w:rPr>
+          <w:i w:val="0"/>
+          <w:sz w:val="22"/>
+        </w:rPr>
+        <w:t>This is the number to watch for every proposal. The math is simple. We keep about $27 a month per customer, and a customer stays about 4 months. So a customer is worth about $108 to us, more if they stay longer.</w:t>
+      </w:r>
+    </w:p>
+    <w:tbl>
+      <w:tblPr>
+        <w:tblStyle w:val="TableGrid"/>
+        <w:tblW w:type="auto" w:w="0"/>
+        <w:tblLayout w:type="fixed"/>
+        <w:tblLook w:firstColumn="1" w:firstRow="1" w:lastColumn="0" w:lastRow="0" w:noHBand="0" w:noVBand="1" w:val="04A0"/>
+      </w:tblPr>
+      <w:tblGrid>
+        <w:gridCol w:w="4824"/>
+        <w:gridCol w:w="4824"/>
+      </w:tblGrid>
+      <w:tr>
+        <w:tc>
+          <w:tcPr>
+            <w:tcW w:type="dxa" w:w="4896"/>
+            <w:vAlign w:val="center"/>
+            <w:shd w:val="clear" w:color="auto" w:fill="1F2A37"/>
+          </w:tcPr>
+          <w:p>
+            <w:pPr>
+              <w:spacing w:after="40" w:before="40"/>
+            </w:pPr>
+            <w:r/>
+            <w:r>
+              <w:rPr>
+                <w:b/>
+                <w:color w:val="FFFFFF"/>
+              </w:rPr>
+              <w:t>Ad cost per customer</w:t>
+            </w:r>
+          </w:p>
+        </w:tc>
+        <w:tc>
+          <w:tcPr>
+            <w:tcW w:type="dxa" w:w="4608"/>
+            <w:vAlign w:val="center"/>
+            <w:shd w:val="clear" w:color="auto" w:fill="1F2A37"/>
+          </w:tcPr>
+          <w:p>
+            <w:pPr>
+              <w:spacing w:after="40" w:before="40"/>
+            </w:pPr>
+            <w:r/>
+            <w:r>
+              <w:rPr>
+                <w:b/>
+                <w:color w:val="FFFFFF"/>
+              </w:rPr>
+              <w:t>What it means</w:t>
+            </w:r>
+          </w:p>
+        </w:tc>
+      </w:tr>
+      <w:tr>
+        <w:tc>
+          <w:tcPr>
+            <w:tcW w:type="dxa" w:w="4896"/>
+            <w:vAlign w:val="center"/>
+          </w:tcPr>
+          <w:p>
+            <w:pPr>
+              <w:spacing w:after="40" w:before="40"/>
+            </w:pPr>
+            <w:r/>
+            <w:r>
+              <w:rPr>
+                <w:b w:val="0"/>
+              </w:rPr>
+              <w:t>What a customer costs us today</w:t>
+            </w:r>
+          </w:p>
+        </w:tc>
+        <w:tc>
+          <w:tcPr>
+            <w:tcW w:type="dxa" w:w="4608"/>
+            <w:vAlign w:val="center"/>
+          </w:tcPr>
+          <w:p>
+            <w:pPr>
+              <w:spacing w:after="40" w:before="40"/>
+            </w:pPr>
+            <w:r/>
+            <w:r>
+              <w:rPr>
+                <w:b/>
+              </w:rPr>
+              <w:t>about $143. Too high.</w:t>
+            </w:r>
+          </w:p>
+        </w:tc>
+      </w:tr>
+      <w:tr>
+        <w:tc>
+          <w:tcPr>
+            <w:tcW w:type="dxa" w:w="4896"/>
+            <w:vAlign w:val="center"/>
+          </w:tcPr>
+          <w:p>
+            <w:pPr>
+              <w:spacing w:after="40" w:before="40"/>
+            </w:pPr>
+            <w:r/>
+            <w:r>
+              <w:rPr>
+                <w:b w:val="0"/>
+              </w:rPr>
+              <w:t>What a customer is worth</w:t>
+            </w:r>
+          </w:p>
+        </w:tc>
+        <w:tc>
+          <w:tcPr>
+            <w:tcW w:type="dxa" w:w="4608"/>
+            <w:vAlign w:val="center"/>
+          </w:tcPr>
+          <w:p>
+            <w:pPr>
+              <w:spacing w:after="40" w:before="40"/>
+            </w:pPr>
+            <w:r/>
+            <w:r>
+              <w:rPr>
+                <w:b/>
+              </w:rPr>
+              <w:t>about $108 to $162</w:t>
+            </w:r>
+          </w:p>
+        </w:tc>
+      </w:tr>
+      <w:tr>
+        <w:tc>
+          <w:tcPr>
+            <w:tcW w:type="dxa" w:w="4896"/>
+            <w:vAlign w:val="center"/>
+          </w:tcPr>
+          <w:p>
+            <w:pPr>
+              <w:spacing w:after="40" w:before="40"/>
+            </w:pPr>
+            <w:r/>
+            <w:r>
+              <w:rPr>
+                <w:b w:val="0"/>
+              </w:rPr>
+              <w:t>Good</w:t>
+            </w:r>
+          </w:p>
+        </w:tc>
+        <w:tc>
+          <w:tcPr>
+            <w:tcW w:type="dxa" w:w="4608"/>
+            <w:vAlign w:val="center"/>
+          </w:tcPr>
+          <w:p>
+            <w:pPr>
+              <w:spacing w:after="40" w:before="40"/>
+            </w:pPr>
+            <w:r/>
+            <w:r>
+              <w:rPr>
+                <w:b/>
+              </w:rPr>
+              <w:t>$50 or less. Strong profit.</w:t>
+            </w:r>
+          </w:p>
+        </w:tc>
+      </w:tr>
+      <w:tr>
+        <w:tc>
+          <w:tcPr>
+            <w:tcW w:type="dxa" w:w="4896"/>
+            <w:vAlign w:val="center"/>
+          </w:tcPr>
+          <w:p>
+            <w:pPr>
+              <w:spacing w:after="40" w:before="40"/>
+            </w:pPr>
+            <w:r/>
+            <w:r>
+              <w:rPr>
+                <w:b w:val="0"/>
+              </w:rPr>
+              <w:t>Acceptable</w:t>
+            </w:r>
+          </w:p>
+        </w:tc>
+        <w:tc>
+          <w:tcPr>
+            <w:tcW w:type="dxa" w:w="4608"/>
+            <w:vAlign w:val="center"/>
+          </w:tcPr>
+          <w:p>
+            <w:pPr>
+              <w:spacing w:after="40" w:before="40"/>
+            </w:pPr>
+            <w:r/>
+            <w:r>
+              <w:rPr>
+                <w:b/>
+              </w:rPr>
+              <w:t>$50 to $100. We make money, slowly.</w:t>
+            </w:r>
+          </w:p>
+        </w:tc>
+      </w:tr>
+      <w:tr>
+        <w:tc>
+          <w:tcPr>
+            <w:tcW w:type="dxa" w:w="4896"/>
+            <w:vAlign w:val="center"/>
+          </w:tcPr>
+          <w:p>
+            <w:pPr>
+              <w:spacing w:after="40" w:before="40"/>
+            </w:pPr>
+            <w:r/>
+            <w:r>
+              <w:rPr>
+                <w:b w:val="0"/>
+              </w:rPr>
+              <w:t>Bad</w:t>
+            </w:r>
+          </w:p>
+        </w:tc>
+        <w:tc>
+          <w:tcPr>
+            <w:tcW w:type="dxa" w:w="4608"/>
+            <w:vAlign w:val="center"/>
+          </w:tcPr>
+          <w:p>
+            <w:pPr>
+              <w:spacing w:after="40" w:before="40"/>
+            </w:pPr>
+            <w:r/>
+            <w:r>
+              <w:rPr>
+                <w:b/>
+              </w:rPr>
+              <w:t>over $100. We lose money. Stop and fix.</w:t>
+            </w:r>
+          </w:p>
+        </w:tc>
+      </w:tr>
+    </w:tbl>
+    <w:p>
+      <w:pPr>
+        <w:spacing w:after="120"/>
+      </w:pPr>
+      <w:r>
+        <w:rPr>
+          <w:i/>
+          <w:color w:val="6B7178"/>
+          <w:sz w:val="21"/>
+        </w:rPr>
+        <w:t>A stronger offer makes more visitors buy. When more visitors buy, each customer costs less in ads. That is how these proposals bring the cost down.</w:t>
       </w:r>
     </w:p>
     <w:p>
@@ -179,7 +485,7 @@
           <w:color w:val="0E7490"/>
           <w:sz w:val="29"/>
         </w:rPr>
-        <w:t>Offer 1: The Comeback Deal</w:t>
+        <w:t>Proposal 1: The Comeback Deal</w:t>
       </w:r>
     </w:p>
     <w:p>
@@ -204,7 +510,7 @@
           <w:i w:val="0"/>
           <w:sz w:val="22"/>
         </w:rPr>
-        <w:t>We show two prices on the site. One box by itself is $90. Or you join the monthly plan and pay $54. That is 40 percent off.</w:t>
+        <w:t>This proposal changes the one time price. The one time price goes from $60 to $90. The plan price does not change. It stays $54.</w:t>
       </w:r>
     </w:p>
     <w:p>
@@ -216,7 +522,7 @@
           <w:i w:val="0"/>
           <w:sz w:val="22"/>
         </w:rPr>
-        <w:t>A pop up asks for the customer's email to unlock the plan price. They enter their email. They join the plan. They pay $54 every month.</w:t>
+        <w:t>Why raise the one time price? To make the plan the clear smart choice. One box alone costs $90. The plan costs $54. That is 40 percent off for joining the plan.</w:t>
       </w:r>
     </w:p>
     <w:p>
@@ -228,7 +534,19 @@
           <w:i w:val="0"/>
           <w:sz w:val="22"/>
         </w:rPr>
-        <w:t>This is the same offer we used before, and it worked. The reason it lost money back then was simple. The product cost too much to make. Now it costs less, so the offer makes money from the very first order.</w:t>
+        <w:t>A pop up asks for the customer's email to unlock the deal. They enter their email. They join the plan. They pay $54 every month.</w:t>
+      </w:r>
+    </w:p>
+    <w:p>
+      <w:pPr>
+        <w:spacing w:after="120"/>
+      </w:pPr>
+      <w:r>
+        <w:rPr>
+          <w:i w:val="0"/>
+          <w:sz w:val="22"/>
+        </w:rPr>
+        <w:t>We ran an offer like this before and it worked. It filled our email list. It only lost money back then because a box cost about $48 to make. Now a box costs about $27, so the same offer makes money from the first order.</w:t>
       </w:r>
     </w:p>
     <w:p>
@@ -426,7 +744,45 @@
               <w:rPr>
                 <w:b w:val="0"/>
               </w:rPr>
-              <w:t>If an ad costs $50 to get a customer</w:t>
+              <w:t>Ad cost per customer to aim for</w:t>
+            </w:r>
+          </w:p>
+        </w:tc>
+        <w:tc>
+          <w:tcPr>
+            <w:tcW w:type="dxa" w:w="4608"/>
+            <w:vAlign w:val="center"/>
+          </w:tcPr>
+          <w:p>
+            <w:pPr>
+              <w:spacing w:after="40" w:before="40"/>
+            </w:pPr>
+            <w:r/>
+            <w:r>
+              <w:rPr>
+                <w:b/>
+              </w:rPr>
+              <w:t>$50 or less. Must stay under $100.</w:t>
+            </w:r>
+          </w:p>
+        </w:tc>
+      </w:tr>
+      <w:tr>
+        <w:tc>
+          <w:tcPr>
+            <w:tcW w:type="dxa" w:w="4896"/>
+            <w:vAlign w:val="center"/>
+          </w:tcPr>
+          <w:p>
+            <w:pPr>
+              <w:spacing w:after="40" w:before="40"/>
+            </w:pPr>
+            <w:r/>
+            <w:r>
+              <w:rPr>
+                <w:b w:val="0"/>
+              </w:rPr>
+              <w:t>At $50 per customer</w:t>
             </w:r>
           </w:p>
         </w:tc>
@@ -464,7 +820,7 @@
               <w:rPr>
                 <w:b w:val="0"/>
               </w:rPr>
-              <w:t>If an ad costs $100 to get a customer</w:t>
+              <w:t>At $100 per customer</w:t>
             </w:r>
           </w:p>
         </w:tc>
@@ -482,7 +838,7 @@
               <w:rPr>
                 <w:b/>
               </w:rPr>
-              <w:t>paid back in about 4 months, so we just break even</w:t>
+              <w:t>paid back in about 4 months. Break even.</w:t>
             </w:r>
           </w:p>
         </w:tc>
@@ -536,7 +892,7 @@
           <w:color w:val="6B7178"/>
           <w:sz w:val="21"/>
         </w:rPr>
-        <w:t>In short: this is the safe choice. It makes money right away and rebuilds the email list.</w:t>
+        <w:t>In short: the safe choice. It makes money right away and rebuilds the email list.</w:t>
       </w:r>
     </w:p>
     <w:p>
@@ -549,7 +905,7 @@
           <w:color w:val="0E7490"/>
           <w:sz w:val="29"/>
         </w:rPr>
-        <w:t>Offer 2: The $1 Trial</w:t>
+        <w:t>Proposal 2: The $1 Trial</w:t>
       </w:r>
     </w:p>
     <w:p>
@@ -586,7 +942,92 @@
           <w:i w:val="0"/>
           <w:sz w:val="22"/>
         </w:rPr>
-        <w:t>This offer is new for Numin. A $1 price is the strongest hook there is. At another brand it brought in far more emails than a normal offer. So we expect it to bring in the most emails by far.</w:t>
+        <w:t>This offer is new for Numin. A $1 price is the strongest hook there is. At another brand it brought in far more emails than a normal offer.</w:t>
+      </w:r>
+    </w:p>
+    <w:p>
+      <w:pPr>
+        <w:spacing w:before="160" w:after="40"/>
+      </w:pPr>
+      <w:r>
+        <w:rPr>
+          <w:b/>
+          <w:color w:val="1F2A37"/>
+          <w:sz w:val="23"/>
+        </w:rPr>
+        <w:t>How we test it</w:t>
+      </w:r>
+    </w:p>
+    <w:p>
+      <w:pPr>
+        <w:spacing w:after="40"/>
+      </w:pPr>
+      <w:r>
+        <w:rPr>
+          <w:i w:val="0"/>
+          <w:sz w:val="22"/>
+        </w:rPr>
+        <w:t>We do not put this on the main site. We test it in a controlled way:</w:t>
+      </w:r>
+    </w:p>
+    <w:p>
+      <w:pPr>
+        <w:pStyle w:val="ListBullet"/>
+        <w:spacing w:after="40"/>
+      </w:pPr>
+      <w:r>
+        <w:rPr>
+          <w:sz w:val="22"/>
+        </w:rPr>
+        <w:t>We build a separate landing page just for this offer.</w:t>
+      </w:r>
+    </w:p>
+    <w:p>
+      <w:pPr>
+        <w:pStyle w:val="ListBullet"/>
+        <w:spacing w:after="40"/>
+      </w:pPr>
+      <w:r>
+        <w:rPr>
+          <w:sz w:val="22"/>
+        </w:rPr>
+        <w:t>We send paid ad traffic to that page only. A small audience with a capped budget.</w:t>
+      </w:r>
+    </w:p>
+    <w:p>
+      <w:pPr>
+        <w:pStyle w:val="ListBullet"/>
+        <w:spacing w:after="40"/>
+      </w:pPr>
+      <w:r>
+        <w:rPr>
+          <w:sz w:val="22"/>
+        </w:rPr>
+        <w:t>Because the page is separate, we control everything. We see exactly what a customer costs in ads, and we can turn it off any time.</w:t>
+      </w:r>
+    </w:p>
+    <w:p>
+      <w:pPr>
+        <w:pStyle w:val="ListBullet"/>
+        <w:spacing w:after="40"/>
+      </w:pPr>
+      <w:r>
+        <w:rPr>
+          <w:sz w:val="22"/>
+        </w:rPr>
+        <w:t>The test answers three questions. What does a customer cost? How many keep the box on day 21? How many ask for refunds?</w:t>
+      </w:r>
+    </w:p>
+    <w:p>
+      <w:pPr>
+        <w:pStyle w:val="ListBullet"/>
+        <w:spacing w:after="40"/>
+      </w:pPr>
+      <w:r>
+        <w:rPr>
+          <w:sz w:val="22"/>
+        </w:rPr>
+        <w:t>If the numbers work, we grow it. If they do not, we shut it off and we have lost very little.</w:t>
       </w:r>
     </w:p>
     <w:p>
@@ -726,7 +1167,7 @@
               <w:rPr>
                 <w:b/>
               </w:rPr>
-              <w:t>about 2,600 to 4,300, around 7 times what we get now</w:t>
+              <w:t>about 2,600 to 4,300. Around 7 times today.</w:t>
             </w:r>
           </w:p>
         </w:tc>
@@ -765,6 +1206,44 @@
                 <w:b/>
               </w:rPr>
               <w:t>only about $3 to $6</w:t>
+            </w:r>
+          </w:p>
+        </w:tc>
+      </w:tr>
+      <w:tr>
+        <w:tc>
+          <w:tcPr>
+            <w:tcW w:type="dxa" w:w="4896"/>
+            <w:vAlign w:val="center"/>
+          </w:tcPr>
+          <w:p>
+            <w:pPr>
+              <w:spacing w:after="40" w:before="40"/>
+            </w:pPr>
+            <w:r/>
+            <w:r>
+              <w:rPr>
+                <w:b w:val="0"/>
+              </w:rPr>
+              <w:t>Ad cost per paying customer to aim for</w:t>
+            </w:r>
+          </w:p>
+        </w:tc>
+        <w:tc>
+          <w:tcPr>
+            <w:tcW w:type="dxa" w:w="4608"/>
+            <w:vAlign w:val="center"/>
+          </w:tcPr>
+          <w:p>
+            <w:pPr>
+              <w:spacing w:after="40" w:before="40"/>
+            </w:pPr>
+            <w:r/>
+            <w:r>
+              <w:rPr>
+                <w:b/>
+              </w:rPr>
+              <w:t>about $50. The test tells us the real number.</w:t>
             </w:r>
           </w:p>
         </w:tc>
@@ -878,7 +1357,7 @@
               <w:rPr>
                 <w:b/>
               </w:rPr>
-              <w:t>High. The money comes from people staying, not the first order.</w:t>
+              <w:t>High. The money comes from people staying.</w:t>
             </w:r>
           </w:p>
         </w:tc>
@@ -918,7 +1397,7 @@
         <w:rPr>
           <w:sz w:val="22"/>
         </w:rPr>
-        <w:t>About half the people need to keep the product on day 21. If fewer stay, we lose money.</w:t>
+        <w:t>About half the people need to keep the box on day 21. If fewer keep it, we lose money.</w:t>
       </w:r>
     </w:p>
     <w:p>
@@ -930,7 +1409,7 @@
         <w:rPr>
           <w:sz w:val="22"/>
         </w:rPr>
-        <w:t>A person who takes the $1 deal and then leaves costs us about $26.</w:t>
+        <w:t>A person who takes the $1 box and leaves costs us about $26, plus the ad money it took to get them.</w:t>
       </w:r>
     </w:p>
     <w:p>
@@ -942,7 +1421,377 @@
         <w:rPr>
           <w:sz w:val="22"/>
         </w:rPr>
-        <w:t>We must keep refunds and card disputes low, under 1 out of 100. The day 21 charge can surprise people, so we tell them up front, remind them before we charge, and make canceling easy.</w:t>
+        <w:t>Refunds and card disputes must stay under 1 out of 100. The day 21 charge can surprise people. So we say it clearly up front, remind them before we charge, and make canceling easy.</w:t>
+      </w:r>
+    </w:p>
+    <w:p>
+      <w:pPr>
+        <w:spacing w:before="280" w:after="80"/>
+      </w:pPr>
+      <w:r>
+        <w:rPr>
+          <w:b/>
+          <w:color w:val="0E7490"/>
+          <w:sz w:val="29"/>
+        </w:rPr>
+        <w:t>Proposal 3: The Quiz</w:t>
+      </w:r>
+    </w:p>
+    <w:p>
+      <w:pPr>
+        <w:spacing w:before="160" w:after="40"/>
+      </w:pPr>
+      <w:r>
+        <w:rPr>
+          <w:b/>
+          <w:color w:val="1F2A37"/>
+          <w:sz w:val="23"/>
+        </w:rPr>
+        <w:t>How it works</w:t>
+      </w:r>
+    </w:p>
+    <w:p>
+      <w:pPr>
+        <w:spacing w:after="120"/>
+      </w:pPr>
+      <w:r>
+        <w:rPr>
+          <w:i w:val="0"/>
+          <w:sz w:val="22"/>
+        </w:rPr>
+        <w:t>A short quiz on our site called: What kind of decision-maker are you?</w:t>
+      </w:r>
+    </w:p>
+    <w:p>
+      <w:pPr>
+        <w:spacing w:after="120"/>
+      </w:pPr>
+      <w:r>
+        <w:rPr>
+          <w:i w:val="0"/>
+          <w:sz w:val="22"/>
+        </w:rPr>
+        <w:t>A visitor answers about 12 quick questions. To see their result, they enter their email. They get their result on the spot, plus a free toolkit of guides sent to their inbox. The quiz is based on a real book about decision fatigue, which is the problem Numin solves.</w:t>
+      </w:r>
+    </w:p>
+    <w:p>
+      <w:pPr>
+        <w:spacing w:after="120"/>
+      </w:pPr>
+      <w:r>
+        <w:rPr>
+          <w:i w:val="0"/>
+          <w:sz w:val="22"/>
+        </w:rPr>
+        <w:t>There is no discount here. We trade something interesting for the email instead of trading money for it. People who take the quiz join our email list, and we sell to them by email over time.</w:t>
+      </w:r>
+    </w:p>
+    <w:p>
+      <w:pPr>
+        <w:spacing w:before="160" w:after="40"/>
+      </w:pPr>
+      <w:r>
+        <w:rPr>
+          <w:b/>
+          <w:color w:val="1F2A37"/>
+          <w:sz w:val="23"/>
+        </w:rPr>
+        <w:t>The money</w:t>
+      </w:r>
+    </w:p>
+    <w:tbl>
+      <w:tblPr>
+        <w:tblStyle w:val="TableGrid"/>
+        <w:tblW w:type="auto" w:w="0"/>
+        <w:tblLayout w:type="fixed"/>
+        <w:tblLook w:firstColumn="1" w:firstRow="1" w:lastColumn="0" w:lastRow="0" w:noHBand="0" w:noVBand="1" w:val="04A0"/>
+      </w:tblPr>
+      <w:tblGrid>
+        <w:gridCol w:w="4824"/>
+        <w:gridCol w:w="4824"/>
+      </w:tblGrid>
+      <w:tr>
+        <w:tc>
+          <w:tcPr>
+            <w:tcW w:type="dxa" w:w="4896"/>
+            <w:vAlign w:val="center"/>
+            <w:shd w:val="clear" w:color="auto" w:fill="1F2A37"/>
+          </w:tcPr>
+          <w:p>
+            <w:pPr>
+              <w:spacing w:after="40" w:before="40"/>
+            </w:pPr>
+            <w:r/>
+            <w:r>
+              <w:rPr>
+                <w:b/>
+                <w:color w:val="FFFFFF"/>
+              </w:rPr>
+              <w:t>What</w:t>
+            </w:r>
+          </w:p>
+        </w:tc>
+        <w:tc>
+          <w:tcPr>
+            <w:tcW w:type="dxa" w:w="4608"/>
+            <w:vAlign w:val="center"/>
+            <w:shd w:val="clear" w:color="auto" w:fill="1F2A37"/>
+          </w:tcPr>
+          <w:p>
+            <w:pPr>
+              <w:spacing w:after="40" w:before="40"/>
+            </w:pPr>
+            <w:r/>
+            <w:r>
+              <w:rPr>
+                <w:b/>
+                <w:color w:val="FFFFFF"/>
+              </w:rPr>
+              <w:t>Number</w:t>
+            </w:r>
+          </w:p>
+        </w:tc>
+      </w:tr>
+      <w:tr>
+        <w:tc>
+          <w:tcPr>
+            <w:tcW w:type="dxa" w:w="4896"/>
+            <w:vAlign w:val="center"/>
+          </w:tcPr>
+          <w:p>
+            <w:pPr>
+              <w:spacing w:after="40" w:before="40"/>
+            </w:pPr>
+            <w:r/>
+            <w:r>
+              <w:rPr>
+                <w:b w:val="0"/>
+              </w:rPr>
+              <w:t>People who join our email list</w:t>
+            </w:r>
+          </w:p>
+        </w:tc>
+        <w:tc>
+          <w:tcPr>
+            <w:tcW w:type="dxa" w:w="4608"/>
+            <w:vAlign w:val="center"/>
+          </w:tcPr>
+          <w:p>
+            <w:pPr>
+              <w:spacing w:after="40" w:before="40"/>
+            </w:pPr>
+            <w:r/>
+            <w:r>
+              <w:rPr>
+                <w:b/>
+              </w:rPr>
+              <w:t>about 5 to 10 out of 100. A guess until we test.</w:t>
+            </w:r>
+          </w:p>
+        </w:tc>
+      </w:tr>
+      <w:tr>
+        <w:tc>
+          <w:tcPr>
+            <w:tcW w:type="dxa" w:w="4896"/>
+            <w:vAlign w:val="center"/>
+          </w:tcPr>
+          <w:p>
+            <w:pPr>
+              <w:spacing w:after="40" w:before="40"/>
+            </w:pPr>
+            <w:r/>
+            <w:r>
+              <w:rPr>
+                <w:b w:val="0"/>
+              </w:rPr>
+              <w:t>New emails each month</w:t>
+            </w:r>
+          </w:p>
+        </w:tc>
+        <w:tc>
+          <w:tcPr>
+            <w:tcW w:type="dxa" w:w="4608"/>
+            <w:vAlign w:val="center"/>
+          </w:tcPr>
+          <w:p>
+            <w:pPr>
+              <w:spacing w:after="40" w:before="40"/>
+            </w:pPr>
+            <w:r/>
+            <w:r>
+              <w:rPr>
+                <w:b/>
+              </w:rPr>
+              <w:t>about 650 to 1,300</w:t>
+            </w:r>
+          </w:p>
+        </w:tc>
+      </w:tr>
+      <w:tr>
+        <w:tc>
+          <w:tcPr>
+            <w:tcW w:type="dxa" w:w="4896"/>
+            <w:vAlign w:val="center"/>
+          </w:tcPr>
+          <w:p>
+            <w:pPr>
+              <w:spacing w:after="40" w:before="40"/>
+            </w:pPr>
+            <w:r/>
+            <w:r>
+              <w:rPr>
+                <w:b w:val="0"/>
+              </w:rPr>
+              <w:t>Discount given away</w:t>
+            </w:r>
+          </w:p>
+        </w:tc>
+        <w:tc>
+          <w:tcPr>
+            <w:tcW w:type="dxa" w:w="4608"/>
+            <w:vAlign w:val="center"/>
+          </w:tcPr>
+          <w:p>
+            <w:pPr>
+              <w:spacing w:after="40" w:before="40"/>
+            </w:pPr>
+            <w:r/>
+            <w:r>
+              <w:rPr>
+                <w:b/>
+              </w:rPr>
+              <w:t>none</w:t>
+            </w:r>
+          </w:p>
+        </w:tc>
+      </w:tr>
+      <w:tr>
+        <w:tc>
+          <w:tcPr>
+            <w:tcW w:type="dxa" w:w="4896"/>
+            <w:vAlign w:val="center"/>
+          </w:tcPr>
+          <w:p>
+            <w:pPr>
+              <w:spacing w:after="40" w:before="40"/>
+            </w:pPr>
+            <w:r/>
+            <w:r>
+              <w:rPr>
+                <w:b w:val="0"/>
+              </w:rPr>
+              <w:t>Cost</w:t>
+            </w:r>
+          </w:p>
+        </w:tc>
+        <w:tc>
+          <w:tcPr>
+            <w:tcW w:type="dxa" w:w="4608"/>
+            <w:vAlign w:val="center"/>
+          </w:tcPr>
+          <w:p>
+            <w:pPr>
+              <w:spacing w:after="40" w:before="40"/>
+            </w:pPr>
+            <w:r/>
+            <w:r>
+              <w:rPr>
+                <w:b/>
+              </w:rPr>
+              <w:t>building the quiz. One time cost. After that, almost free.</w:t>
+            </w:r>
+          </w:p>
+        </w:tc>
+      </w:tr>
+      <w:tr>
+        <w:tc>
+          <w:tcPr>
+            <w:tcW w:type="dxa" w:w="4896"/>
+            <w:vAlign w:val="center"/>
+          </w:tcPr>
+          <w:p>
+            <w:pPr>
+              <w:spacing w:after="40" w:before="40"/>
+            </w:pPr>
+            <w:r/>
+            <w:r>
+              <w:rPr>
+                <w:b w:val="0"/>
+              </w:rPr>
+              <w:t>Sales</w:t>
+            </w:r>
+          </w:p>
+        </w:tc>
+        <w:tc>
+          <w:tcPr>
+            <w:tcW w:type="dxa" w:w="4608"/>
+            <w:vAlign w:val="center"/>
+          </w:tcPr>
+          <w:p>
+            <w:pPr>
+              <w:spacing w:after="40" w:before="40"/>
+            </w:pPr>
+            <w:r/>
+            <w:r>
+              <w:rPr>
+                <w:b/>
+              </w:rPr>
+              <w:t>not direct. The quiz collects emails. Email does the selling later.</w:t>
+            </w:r>
+          </w:p>
+        </w:tc>
+      </w:tr>
+      <w:tr>
+        <w:tc>
+          <w:tcPr>
+            <w:tcW w:type="dxa" w:w="4896"/>
+            <w:vAlign w:val="center"/>
+          </w:tcPr>
+          <w:p>
+            <w:pPr>
+              <w:spacing w:after="40" w:before="40"/>
+            </w:pPr>
+            <w:r/>
+            <w:r>
+              <w:rPr>
+                <w:b w:val="0"/>
+              </w:rPr>
+              <w:t>Risk</w:t>
+            </w:r>
+          </w:p>
+        </w:tc>
+        <w:tc>
+          <w:tcPr>
+            <w:tcW w:type="dxa" w:w="4608"/>
+            <w:vAlign w:val="center"/>
+          </w:tcPr>
+          <w:p>
+            <w:pPr>
+              <w:spacing w:after="40" w:before="40"/>
+            </w:pPr>
+            <w:r/>
+            <w:r>
+              <w:rPr>
+                <w:b/>
+              </w:rPr>
+              <w:t>Low money risk. The risks are build time, and people quitting the quiz halfway.</w:t>
+            </w:r>
+          </w:p>
+        </w:tc>
+      </w:tr>
+    </w:tbl>
+    <w:p>
+      <w:pPr>
+        <w:spacing w:after="120"/>
+      </w:pPr>
+      <w:r>
+        <w:rPr>
+          <w:i/>
+          <w:color w:val="6B7178"/>
+          <w:sz w:val="21"/>
+        </w:rPr>
+        <w:t>In short: the brand friendly choice. It fits what Numin stands for and costs us no discount. But it must be built first, and we will not know the real numbers until we test it.</w:t>
       </w:r>
     </w:p>
     <w:p>
@@ -955,7 +1804,7 @@
           <w:color w:val="1F2A37"/>
           <w:sz w:val="29"/>
         </w:rPr>
-        <w:t>The two offers side by side</w:t>
+        <w:t>The three proposals side by side</w:t>
       </w:r>
     </w:p>
     <w:tbl>
@@ -966,14 +1815,15 @@
         <w:tblLook w:firstColumn="1" w:firstRow="1" w:lastColumn="0" w:lastRow="0" w:noHBand="0" w:noVBand="1" w:val="04A0"/>
       </w:tblPr>
       <w:tblGrid>
-        <w:gridCol w:w="3216"/>
-        <w:gridCol w:w="3216"/>
-        <w:gridCol w:w="3216"/>
+        <w:gridCol w:w="2412"/>
+        <w:gridCol w:w="2412"/>
+        <w:gridCol w:w="2412"/>
+        <w:gridCol w:w="2412"/>
       </w:tblGrid>
       <w:tr>
         <w:tc>
           <w:tcPr>
-            <w:tcW w:type="dxa" w:w="3456"/>
+            <w:tcW w:type="dxa" w:w="2736"/>
             <w:vAlign w:val="center"/>
             <w:shd w:val="clear" w:color="auto" w:fill="1F2A37"/>
           </w:tcPr>
@@ -992,7 +1842,7 @@
         </w:tc>
         <w:tc>
           <w:tcPr>
-            <w:tcW w:type="dxa" w:w="3024"/>
+            <w:tcW w:type="dxa" w:w="2304"/>
             <w:vAlign w:val="center"/>
             <w:shd w:val="clear" w:color="auto" w:fill="1F2A37"/>
           </w:tcPr>
@@ -1006,13 +1856,13 @@
                 <w:b/>
                 <w:color w:val="FFFFFF"/>
               </w:rPr>
-              <w:t>The Comeback Deal</w:t>
+              <w:t>Comeback Deal</w:t>
             </w:r>
           </w:p>
         </w:tc>
         <w:tc>
           <w:tcPr>
-            <w:tcW w:type="dxa" w:w="3024"/>
+            <w:tcW w:type="dxa" w:w="2304"/>
             <w:vAlign w:val="center"/>
             <w:shd w:val="clear" w:color="auto" w:fill="1F2A37"/>
           </w:tcPr>
@@ -1026,7 +1876,27 @@
                 <w:b/>
                 <w:color w:val="FFFFFF"/>
               </w:rPr>
-              <w:t>The $1 Trial</w:t>
+              <w:t>$1 Trial</w:t>
+            </w:r>
+          </w:p>
+        </w:tc>
+        <w:tc>
+          <w:tcPr>
+            <w:tcW w:type="dxa" w:w="2304"/>
+            <w:vAlign w:val="center"/>
+            <w:shd w:val="clear" w:color="auto" w:fill="1F2A37"/>
+          </w:tcPr>
+          <w:p>
+            <w:pPr>
+              <w:spacing w:after="40" w:before="40"/>
+            </w:pPr>
+            <w:r/>
+            <w:r>
+              <w:rPr>
+                <w:b/>
+                <w:color w:val="FFFFFF"/>
+              </w:rPr>
+              <w:t>Quiz</w:t>
             </w:r>
           </w:p>
         </w:tc>
@@ -1034,7 +1904,7 @@
       <w:tr>
         <w:tc>
           <w:tcPr>
-            <w:tcW w:type="dxa" w:w="3456"/>
+            <w:tcW w:type="dxa" w:w="2736"/>
             <w:vAlign w:val="center"/>
           </w:tcPr>
           <w:p>
@@ -1052,7 +1922,7 @@
         </w:tc>
         <w:tc>
           <w:tcPr>
-            <w:tcW w:type="dxa" w:w="3024"/>
+            <w:tcW w:type="dxa" w:w="2304"/>
             <w:vAlign w:val="center"/>
           </w:tcPr>
           <w:p>
@@ -1070,7 +1940,7 @@
         </w:tc>
         <w:tc>
           <w:tcPr>
-            <w:tcW w:type="dxa" w:w="3024"/>
+            <w:tcW w:type="dxa" w:w="2304"/>
             <w:vAlign w:val="center"/>
           </w:tcPr>
           <w:p>
@@ -1086,11 +1956,29 @@
             </w:r>
           </w:p>
         </w:tc>
+        <w:tc>
+          <w:tcPr>
+            <w:tcW w:type="dxa" w:w="2304"/>
+            <w:vAlign w:val="center"/>
+          </w:tcPr>
+          <w:p>
+            <w:pPr>
+              <w:spacing w:after="40" w:before="40"/>
+            </w:pPr>
+            <w:r/>
+            <w:r>
+              <w:rPr>
+                <w:b w:val="0"/>
+              </w:rPr>
+              <w:t>650 to 1,300</w:t>
+            </w:r>
+          </w:p>
+        </w:tc>
       </w:tr>
       <w:tr>
         <w:tc>
           <w:tcPr>
-            <w:tcW w:type="dxa" w:w="3456"/>
+            <w:tcW w:type="dxa" w:w="2736"/>
             <w:vAlign w:val="center"/>
           </w:tcPr>
           <w:p>
@@ -1102,13 +1990,13 @@
               <w:rPr>
                 <w:b/>
               </w:rPr>
-              <w:t>Money on the first order</w:t>
+              <w:t>Money on first order</w:t>
             </w:r>
           </w:p>
         </w:tc>
         <w:tc>
           <w:tcPr>
-            <w:tcW w:type="dxa" w:w="3024"/>
+            <w:tcW w:type="dxa" w:w="2304"/>
             <w:vAlign w:val="center"/>
           </w:tcPr>
           <w:p>
@@ -1126,7 +2014,7 @@
         </w:tc>
         <w:tc>
           <w:tcPr>
-            <w:tcW w:type="dxa" w:w="3024"/>
+            <w:tcW w:type="dxa" w:w="2304"/>
             <w:vAlign w:val="center"/>
           </w:tcPr>
           <w:p>
@@ -1142,11 +2030,29 @@
             </w:r>
           </w:p>
         </w:tc>
+        <w:tc>
+          <w:tcPr>
+            <w:tcW w:type="dxa" w:w="2304"/>
+            <w:vAlign w:val="center"/>
+          </w:tcPr>
+          <w:p>
+            <w:pPr>
+              <w:spacing w:after="40" w:before="40"/>
+            </w:pPr>
+            <w:r/>
+            <w:r>
+              <w:rPr>
+                <w:b w:val="0"/>
+              </w:rPr>
+              <w:t>none, sells later</w:t>
+            </w:r>
+          </w:p>
+        </w:tc>
       </w:tr>
       <w:tr>
         <w:tc>
           <w:tcPr>
-            <w:tcW w:type="dxa" w:w="3456"/>
+            <w:tcW w:type="dxa" w:w="2736"/>
             <w:vAlign w:val="center"/>
           </w:tcPr>
           <w:p>
@@ -1158,13 +2064,13 @@
               <w:rPr>
                 <w:b/>
               </w:rPr>
-              <w:t>Makes money on the first order</w:t>
+              <w:t>Profitable on first order</w:t>
             </w:r>
           </w:p>
         </w:tc>
         <w:tc>
           <w:tcPr>
-            <w:tcW w:type="dxa" w:w="3024"/>
+            <w:tcW w:type="dxa" w:w="2304"/>
             <w:vAlign w:val="center"/>
           </w:tcPr>
           <w:p>
@@ -1182,7 +2088,7 @@
         </w:tc>
         <w:tc>
           <w:tcPr>
-            <w:tcW w:type="dxa" w:w="3024"/>
+            <w:tcW w:type="dxa" w:w="2304"/>
             <w:vAlign w:val="center"/>
           </w:tcPr>
           <w:p>
@@ -1194,7 +2100,25 @@
               <w:rPr>
                 <w:b w:val="0"/>
               </w:rPr>
-              <w:t>No. It needs reorders.</w:t>
+              <w:t>No. Needs reorders.</w:t>
+            </w:r>
+          </w:p>
+        </w:tc>
+        <w:tc>
+          <w:tcPr>
+            <w:tcW w:type="dxa" w:w="2304"/>
+            <w:vAlign w:val="center"/>
+          </w:tcPr>
+          <w:p>
+            <w:pPr>
+              <w:spacing w:after="40" w:before="40"/>
+            </w:pPr>
+            <w:r/>
+            <w:r>
+              <w:rPr>
+                <w:b w:val="0"/>
+              </w:rPr>
+              <w:t>Not direct</w:t>
             </w:r>
           </w:p>
         </w:tc>
@@ -1202,7 +2126,7 @@
       <w:tr>
         <w:tc>
           <w:tcPr>
-            <w:tcW w:type="dxa" w:w="3456"/>
+            <w:tcW w:type="dxa" w:w="2736"/>
             <w:vAlign w:val="center"/>
           </w:tcPr>
           <w:p>
@@ -1214,13 +2138,13 @@
               <w:rPr>
                 <w:b/>
               </w:rPr>
-              <w:t>Worth of a customer (6 months)</w:t>
+              <w:t>Discount given away</w:t>
             </w:r>
           </w:p>
         </w:tc>
         <w:tc>
           <w:tcPr>
-            <w:tcW w:type="dxa" w:w="3024"/>
+            <w:tcW w:type="dxa" w:w="2304"/>
             <w:vAlign w:val="center"/>
           </w:tcPr>
           <w:p>
@@ -1232,13 +2156,13 @@
               <w:rPr>
                 <w:b w:val="0"/>
               </w:rPr>
-              <w:t>about $162</w:t>
+              <w:t>40% off one time price</w:t>
             </w:r>
           </w:p>
         </w:tc>
         <w:tc>
           <w:tcPr>
-            <w:tcW w:type="dxa" w:w="3024"/>
+            <w:tcW w:type="dxa" w:w="2304"/>
             <w:vAlign w:val="center"/>
           </w:tcPr>
           <w:p>
@@ -1250,7 +2174,25 @@
               <w:rPr>
                 <w:b w:val="0"/>
               </w:rPr>
-              <w:t>about $162</w:t>
+              <w:t>first box for $1</w:t>
+            </w:r>
+          </w:p>
+        </w:tc>
+        <w:tc>
+          <w:tcPr>
+            <w:tcW w:type="dxa" w:w="2304"/>
+            <w:vAlign w:val="center"/>
+          </w:tcPr>
+          <w:p>
+            <w:pPr>
+              <w:spacing w:after="40" w:before="40"/>
+            </w:pPr>
+            <w:r/>
+            <w:r>
+              <w:rPr>
+                <w:b w:val="0"/>
+              </w:rPr>
+              <w:t>none</w:t>
             </w:r>
           </w:p>
         </w:tc>
@@ -1258,7 +2200,7 @@
       <w:tr>
         <w:tc>
           <w:tcPr>
-            <w:tcW w:type="dxa" w:w="3456"/>
+            <w:tcW w:type="dxa" w:w="2736"/>
             <w:vAlign w:val="center"/>
           </w:tcPr>
           <w:p>
@@ -1276,7 +2218,7 @@
         </w:tc>
         <w:tc>
           <w:tcPr>
-            <w:tcW w:type="dxa" w:w="3024"/>
+            <w:tcW w:type="dxa" w:w="2304"/>
             <w:vAlign w:val="center"/>
           </w:tcPr>
           <w:p>
@@ -1294,7 +2236,7 @@
         </w:tc>
         <w:tc>
           <w:tcPr>
-            <w:tcW w:type="dxa" w:w="3024"/>
+            <w:tcW w:type="dxa" w:w="2304"/>
             <w:vAlign w:val="center"/>
           </w:tcPr>
           <w:p>
@@ -1310,11 +2252,29 @@
             </w:r>
           </w:p>
         </w:tc>
+        <w:tc>
+          <w:tcPr>
+            <w:tcW w:type="dxa" w:w="2304"/>
+            <w:vAlign w:val="center"/>
+          </w:tcPr>
+          <w:p>
+            <w:pPr>
+              <w:spacing w:after="40" w:before="40"/>
+            </w:pPr>
+            <w:r/>
+            <w:r>
+              <w:rPr>
+                <w:b w:val="0"/>
+              </w:rPr>
+              <w:t>Low</w:t>
+            </w:r>
+          </w:p>
+        </w:tc>
       </w:tr>
       <w:tr>
         <w:tc>
           <w:tcPr>
-            <w:tcW w:type="dxa" w:w="3456"/>
+            <w:tcW w:type="dxa" w:w="2736"/>
             <w:vAlign w:val="center"/>
           </w:tcPr>
           <w:p>
@@ -1332,7 +2292,7 @@
         </w:tc>
         <w:tc>
           <w:tcPr>
-            <w:tcW w:type="dxa" w:w="3024"/>
+            <w:tcW w:type="dxa" w:w="2304"/>
             <w:vAlign w:val="center"/>
           </w:tcPr>
           <w:p>
@@ -1344,13 +2304,13 @@
               <w:rPr>
                 <w:b w:val="0"/>
               </w:rPr>
-              <w:t>Steady, safe growth</w:t>
+              <w:t>steady, safe growth</w:t>
             </w:r>
           </w:p>
         </w:tc>
         <w:tc>
           <w:tcPr>
-            <w:tcW w:type="dxa" w:w="3024"/>
+            <w:tcW w:type="dxa" w:w="2304"/>
             <w:vAlign w:val="center"/>
           </w:tcPr>
           <w:p>
@@ -1362,7 +2322,25 @@
               <w:rPr>
                 <w:b w:val="0"/>
               </w:rPr>
-              <w:t>A lot of emails fast</w:t>
+              <w:t>a lot of emails fast</w:t>
+            </w:r>
+          </w:p>
+        </w:tc>
+        <w:tc>
+          <w:tcPr>
+            <w:tcW w:type="dxa" w:w="2304"/>
+            <w:vAlign w:val="center"/>
+          </w:tcPr>
+          <w:p>
+            <w:pPr>
+              <w:spacing w:after="40" w:before="40"/>
+            </w:pPr>
+            <w:r/>
+            <w:r>
+              <w:rPr>
+                <w:b w:val="0"/>
+              </w:rPr>
+              <w:t>emails with no discount</w:t>
             </w:r>
           </w:p>
         </w:tc>
@@ -1387,7 +2365,7 @@
         <w:spacing w:after="60"/>
       </w:pPr>
       <w:r>
-        <w:t>Start the Comeback Deal now. It is low risk. It makes money on the first order. It rebuilds the email list we lost.</w:t>
+        <w:t>Start the Comeback Deal now. Low risk. It makes money on the first order. It rebuilds the email list.</w:t>
       </w:r>
     </w:p>
     <w:p>
@@ -1396,7 +2374,7 @@
         <w:spacing w:after="60"/>
       </w:pPr>
       <w:r>
-        <w:t>Test the $1 Trial on a small part of our traffic. Watch it closely. Only grow it if enough people stay after day 21 and refunds stay low.</w:t>
+        <w:t>Test the $1 Trial on its own landing page with a small paid ads budget. Watch the cost per customer, how many keep the box on day 21, and refunds. Grow it only if those numbers work.</w:t>
       </w:r>
     </w:p>
     <w:p>
@@ -1405,7 +2383,7 @@
         <w:spacing w:after="60"/>
       </w:pPr>
       <w:r>
-        <w:t>The $1 Trial is new for us, so we do not have our own numbers yet. Treat the first run as a test. Track how many people stay, how many reorder, and how many ask for refunds.</w:t>
+        <w:t>Start building the quiz now, since it takes the longest. Test it when it is ready.</w:t>
       </w:r>
     </w:p>
     <w:p>
@@ -1431,7 +2409,7 @@
           <w:color w:val="6B7178"/>
           <w:sz w:val="20"/>
         </w:rPr>
-        <w:t>These are estimates for planning. They are not final results. We will confirm them when we run the offers.</w:t>
+        <w:t>These are estimates for planning. They are not results. We confirm them when we run the offers.</w:t>
       </w:r>
     </w:p>
     <w:p>
@@ -1444,7 +2422,7 @@
           <w:color w:val="6B7178"/>
           <w:sz w:val="20"/>
         </w:rPr>
-        <w:t>A box is $54 on the monthly plan and $90 one time. It costs about $27 to make and ship.</w:t>
+        <w:t>Plan price $54. One time price $60 today, $90 under Proposal 1. A box costs about $27 to make and ship.</w:t>
       </w:r>
     </w:p>
     <w:p>
@@ -1470,7 +2448,20 @@
           <w:color w:val="6B7178"/>
           <w:sz w:val="20"/>
         </w:rPr>
-        <w:t>The Comeback Deal got about 6 out of 100 sign ups here before.</w:t>
+        <w:t>Ad costs today come from our own ad accounts: about $143 per customer on average, over $200 in the worst month.</w:t>
+      </w:r>
+    </w:p>
+    <w:p>
+      <w:pPr>
+        <w:pStyle w:val="ListBullet"/>
+        <w:spacing w:after="40"/>
+      </w:pPr>
+      <w:r>
+        <w:rPr>
+          <w:color w:val="6B7178"/>
+          <w:sz w:val="20"/>
+        </w:rPr>
+        <w:t>The Comeback Deal got about 6 out of 100 sign ups when we ran it here before.</w:t>
       </w:r>
     </w:p>
     <w:p>
@@ -1496,7 +2487,20 @@
           <w:color w:val="6B7178"/>
           <w:sz w:val="20"/>
         </w:rPr>
-        <w:t>Customer worth: about $108 if they stay 4 months, $162 for 6 months, $324 for a full year. Most do not stay a full year yet.</w:t>
+        <w:t>The quiz is not built yet. The 5 to 10 out of 100 number is what quizzes typically do compared to plain pop ups.</w:t>
+      </w:r>
+    </w:p>
+    <w:p>
+      <w:pPr>
+        <w:pStyle w:val="ListBullet"/>
+        <w:spacing w:after="40"/>
+      </w:pPr>
+      <w:r>
+        <w:rPr>
+          <w:color w:val="6B7178"/>
+          <w:sz w:val="20"/>
+        </w:rPr>
+        <w:t>Customer worth: about $108 if they stay 4 months, $162 for 6 months, $324 for a full year.</w:t>
       </w:r>
     </w:p>
     <w:sectPr>

</xml_diff>

<commit_message>
Reframe comparison as risk vs reward with CAC, conversion, LTV:CAC, and list-growth metrics
</commit_message>
<xml_diff>
--- a/Numin-Acquisition-Offer-Proposal.docx
+++ b/Numin-Acquisition-Offer-Proposal.docx
@@ -24,7 +24,7 @@
           <w:color w:val="6B7178"/>
           <w:sz w:val="21"/>
         </w:rPr>
-        <w:t>Three proposals. What each one is, and the money behind it.  June 2026</w:t>
+        <w:t>Three proposals. What each one is, the money behind it, and the risk vs reward.  June 2026</w:t>
       </w:r>
     </w:p>
     <w:p>
@@ -1804,7 +1804,19 @@
           <w:color w:val="1F2A37"/>
           <w:sz w:val="29"/>
         </w:rPr>
-        <w:t>The three proposals side by side</w:t>
+        <w:t>Risk vs reward, side by side</w:t>
+      </w:r>
+    </w:p>
+    <w:p>
+      <w:pPr>
+        <w:spacing w:after="120"/>
+      </w:pPr>
+      <w:r>
+        <w:rPr>
+          <w:i w:val="0"/>
+          <w:sz w:val="22"/>
+        </w:rPr>
+        <w:t>Where we stand today: under 3 of every 100 visitors join the email list. About 1 of every 100 visitors buys. A customer costs about $143 in ads. And for every $1 we spend on ads, we get back about 75 cents. The table shows what each proposal could do to those numbers.</w:t>
       </w:r>
     </w:p>
     <w:tbl>
@@ -1823,7 +1835,7 @@
       <w:tr>
         <w:tc>
           <w:tcPr>
-            <w:tcW w:type="dxa" w:w="2736"/>
+            <w:tcW w:type="dxa" w:w="3168"/>
             <w:vAlign w:val="center"/>
             <w:shd w:val="clear" w:color="auto" w:fill="1F2A37"/>
           </w:tcPr>
@@ -1842,7 +1854,7 @@
         </w:tc>
         <w:tc>
           <w:tcPr>
-            <w:tcW w:type="dxa" w:w="2304"/>
+            <w:tcW w:type="dxa" w:w="2160"/>
             <w:vAlign w:val="center"/>
             <w:shd w:val="clear" w:color="auto" w:fill="1F2A37"/>
           </w:tcPr>
@@ -1862,7 +1874,7 @@
         </w:tc>
         <w:tc>
           <w:tcPr>
-            <w:tcW w:type="dxa" w:w="2304"/>
+            <w:tcW w:type="dxa" w:w="2160"/>
             <w:vAlign w:val="center"/>
             <w:shd w:val="clear" w:color="auto" w:fill="1F2A37"/>
           </w:tcPr>
@@ -1882,7 +1894,7 @@
         </w:tc>
         <w:tc>
           <w:tcPr>
-            <w:tcW w:type="dxa" w:w="2304"/>
+            <w:tcW w:type="dxa" w:w="2160"/>
             <w:vAlign w:val="center"/>
             <w:shd w:val="clear" w:color="auto" w:fill="1F2A37"/>
           </w:tcPr>
@@ -1904,7 +1916,7 @@
       <w:tr>
         <w:tc>
           <w:tcPr>
-            <w:tcW w:type="dxa" w:w="2736"/>
+            <w:tcW w:type="dxa" w:w="3168"/>
             <w:vAlign w:val="center"/>
           </w:tcPr>
           <w:p>
@@ -1916,13 +1928,87 @@
               <w:rPr>
                 <w:b/>
               </w:rPr>
-              <w:t>New emails each month</w:t>
+              <w:t>Email sign ups per 100 visitors (today: under 3)</w:t>
             </w:r>
           </w:p>
         </w:tc>
         <w:tc>
           <w:tcPr>
-            <w:tcW w:type="dxa" w:w="2304"/>
+            <w:tcW w:type="dxa" w:w="2160"/>
+            <w:vAlign w:val="center"/>
+          </w:tcPr>
+          <w:p>
+            <w:pPr>
+              <w:spacing w:after="40" w:before="40"/>
+            </w:pPr>
+            <w:r/>
+            <w:r>
+              <w:rPr>
+                <w:b w:val="0"/>
+              </w:rPr>
+              <w:t>about 6</w:t>
+            </w:r>
+          </w:p>
+        </w:tc>
+        <w:tc>
+          <w:tcPr>
+            <w:tcW w:type="dxa" w:w="2160"/>
+            <w:vAlign w:val="center"/>
+          </w:tcPr>
+          <w:p>
+            <w:pPr>
+              <w:spacing w:after="40" w:before="40"/>
+            </w:pPr>
+            <w:r/>
+            <w:r>
+              <w:rPr>
+                <w:b w:val="0"/>
+              </w:rPr>
+              <w:t>about 20</w:t>
+            </w:r>
+          </w:p>
+        </w:tc>
+        <w:tc>
+          <w:tcPr>
+            <w:tcW w:type="dxa" w:w="2160"/>
+            <w:vAlign w:val="center"/>
+          </w:tcPr>
+          <w:p>
+            <w:pPr>
+              <w:spacing w:after="40" w:before="40"/>
+            </w:pPr>
+            <w:r/>
+            <w:r>
+              <w:rPr>
+                <w:b w:val="0"/>
+              </w:rPr>
+              <w:t>5 to 10</w:t>
+            </w:r>
+          </w:p>
+        </w:tc>
+      </w:tr>
+      <w:tr>
+        <w:tc>
+          <w:tcPr>
+            <w:tcW w:type="dxa" w:w="3168"/>
+            <w:vAlign w:val="center"/>
+          </w:tcPr>
+          <w:p>
+            <w:pPr>
+              <w:spacing w:after="40" w:before="40"/>
+            </w:pPr>
+            <w:r/>
+            <w:r>
+              <w:rPr>
+                <w:b/>
+              </w:rPr>
+              <w:t>New emails a month (today: about 350)</w:t>
+            </w:r>
+          </w:p>
+        </w:tc>
+        <w:tc>
+          <w:tcPr>
+            <w:tcW w:type="dxa" w:w="2160"/>
             <w:vAlign w:val="center"/>
           </w:tcPr>
           <w:p>
@@ -1940,7 +2026,7 @@
         </w:tc>
         <w:tc>
           <w:tcPr>
-            <w:tcW w:type="dxa" w:w="2304"/>
+            <w:tcW w:type="dxa" w:w="2160"/>
             <w:vAlign w:val="center"/>
           </w:tcPr>
           <w:p>
@@ -1958,7 +2044,7 @@
         </w:tc>
         <w:tc>
           <w:tcPr>
-            <w:tcW w:type="dxa" w:w="2304"/>
+            <w:tcW w:type="dxa" w:w="2160"/>
             <w:vAlign w:val="center"/>
           </w:tcPr>
           <w:p>
@@ -1978,7 +2064,7 @@
       <w:tr>
         <w:tc>
           <w:tcPr>
-            <w:tcW w:type="dxa" w:w="2736"/>
+            <w:tcW w:type="dxa" w:w="3168"/>
             <w:vAlign w:val="center"/>
           </w:tcPr>
           <w:p>
@@ -1990,13 +2076,13 @@
               <w:rPr>
                 <w:b/>
               </w:rPr>
-              <w:t>Money on first order</w:t>
+              <w:t>How fast the list grows</w:t>
             </w:r>
           </w:p>
         </w:tc>
         <w:tc>
           <w:tcPr>
-            <w:tcW w:type="dxa" w:w="2304"/>
+            <w:tcW w:type="dxa" w:w="2160"/>
             <w:vAlign w:val="center"/>
           </w:tcPr>
           <w:p>
@@ -2008,13 +2094,13 @@
               <w:rPr>
                 <w:b w:val="0"/>
               </w:rPr>
-              <w:t>about $27</w:t>
+              <w:t>about 2 times today</w:t>
             </w:r>
           </w:p>
         </w:tc>
         <w:tc>
           <w:tcPr>
-            <w:tcW w:type="dxa" w:w="2304"/>
+            <w:tcW w:type="dxa" w:w="2160"/>
             <w:vAlign w:val="center"/>
           </w:tcPr>
           <w:p>
@@ -2026,13 +2112,13 @@
               <w:rPr>
                 <w:b w:val="0"/>
               </w:rPr>
-              <w:t>about $3 to $6</w:t>
+              <w:t>7 to 12 times today</w:t>
             </w:r>
           </w:p>
         </w:tc>
         <w:tc>
           <w:tcPr>
-            <w:tcW w:type="dxa" w:w="2304"/>
+            <w:tcW w:type="dxa" w:w="2160"/>
             <w:vAlign w:val="center"/>
           </w:tcPr>
           <w:p>
@@ -2044,7 +2130,7 @@
               <w:rPr>
                 <w:b w:val="0"/>
               </w:rPr>
-              <w:t>none, sells later</w:t>
+              <w:t>2 to 4 times today</w:t>
             </w:r>
           </w:p>
         </w:tc>
@@ -2052,7 +2138,7 @@
       <w:tr>
         <w:tc>
           <w:tcPr>
-            <w:tcW w:type="dxa" w:w="2736"/>
+            <w:tcW w:type="dxa" w:w="3168"/>
             <w:vAlign w:val="center"/>
           </w:tcPr>
           <w:p>
@@ -2064,13 +2150,13 @@
               <w:rPr>
                 <w:b/>
               </w:rPr>
-              <w:t>Profitable on first order</w:t>
+              <w:t>Buyers per 100 visitors (today: about 1)</w:t>
             </w:r>
           </w:p>
         </w:tc>
         <w:tc>
           <w:tcPr>
-            <w:tcW w:type="dxa" w:w="2304"/>
+            <w:tcW w:type="dxa" w:w="2160"/>
             <w:vAlign w:val="center"/>
           </w:tcPr>
           <w:p>
@@ -2082,13 +2168,13 @@
               <w:rPr>
                 <w:b w:val="0"/>
               </w:rPr>
-              <w:t>Yes</w:t>
+              <w:t>about 2</w:t>
             </w:r>
           </w:p>
         </w:tc>
         <w:tc>
           <w:tcPr>
-            <w:tcW w:type="dxa" w:w="2304"/>
+            <w:tcW w:type="dxa" w:w="2160"/>
             <w:vAlign w:val="center"/>
           </w:tcPr>
           <w:p>
@@ -2100,13 +2186,13 @@
               <w:rPr>
                 <w:b w:val="0"/>
               </w:rPr>
-              <w:t>No. Needs reorders.</w:t>
+              <w:t>4 to 6 on its own page</w:t>
             </w:r>
           </w:p>
         </w:tc>
         <w:tc>
           <w:tcPr>
-            <w:tcW w:type="dxa" w:w="2304"/>
+            <w:tcW w:type="dxa" w:w="2160"/>
             <w:vAlign w:val="center"/>
           </w:tcPr>
           <w:p>
@@ -2118,7 +2204,7 @@
               <w:rPr>
                 <w:b w:val="0"/>
               </w:rPr>
-              <w:t>Not direct</w:t>
+              <w:t>no direct change</w:t>
             </w:r>
           </w:p>
         </w:tc>
@@ -2126,7 +2212,7 @@
       <w:tr>
         <w:tc>
           <w:tcPr>
-            <w:tcW w:type="dxa" w:w="2736"/>
+            <w:tcW w:type="dxa" w:w="3168"/>
             <w:vAlign w:val="center"/>
           </w:tcPr>
           <w:p>
@@ -2138,13 +2224,13 @@
               <w:rPr>
                 <w:b/>
               </w:rPr>
-              <w:t>Discount given away</w:t>
+              <w:t>Ad cost per customer (today: about $143)</w:t>
             </w:r>
           </w:p>
         </w:tc>
         <w:tc>
           <w:tcPr>
-            <w:tcW w:type="dxa" w:w="2304"/>
+            <w:tcW w:type="dxa" w:w="2160"/>
             <w:vAlign w:val="center"/>
           </w:tcPr>
           <w:p>
@@ -2156,13 +2242,13 @@
               <w:rPr>
                 <w:b w:val="0"/>
               </w:rPr>
-              <w:t>40% off one time price</w:t>
+              <w:t>drops toward $70 to $100. Aim for $50.</w:t>
             </w:r>
           </w:p>
         </w:tc>
         <w:tc>
           <w:tcPr>
-            <w:tcW w:type="dxa" w:w="2304"/>
+            <w:tcW w:type="dxa" w:w="2160"/>
             <w:vAlign w:val="center"/>
           </w:tcPr>
           <w:p>
@@ -2174,13 +2260,13 @@
               <w:rPr>
                 <w:b w:val="0"/>
               </w:rPr>
-              <w:t>first box for $1</w:t>
+              <w:t>drops toward $50 to $80 per paying customer</w:t>
             </w:r>
           </w:p>
         </w:tc>
         <w:tc>
           <w:tcPr>
-            <w:tcW w:type="dxa" w:w="2304"/>
+            <w:tcW w:type="dxa" w:w="2160"/>
             <w:vAlign w:val="center"/>
           </w:tcPr>
           <w:p>
@@ -2192,7 +2278,7 @@
               <w:rPr>
                 <w:b w:val="0"/>
               </w:rPr>
-              <w:t>none</w:t>
+              <w:t>near zero for customers won by email</w:t>
             </w:r>
           </w:p>
         </w:tc>
@@ -2200,7 +2286,7 @@
       <w:tr>
         <w:tc>
           <w:tcPr>
-            <w:tcW w:type="dxa" w:w="2736"/>
+            <w:tcW w:type="dxa" w:w="3168"/>
             <w:vAlign w:val="center"/>
           </w:tcPr>
           <w:p>
@@ -2212,13 +2298,13 @@
               <w:rPr>
                 <w:b/>
               </w:rPr>
-              <w:t>Risk</w:t>
+              <w:t>Money back per $1 of ads (today: about $0.75)</w:t>
             </w:r>
           </w:p>
         </w:tc>
         <w:tc>
           <w:tcPr>
-            <w:tcW w:type="dxa" w:w="2304"/>
+            <w:tcW w:type="dxa" w:w="2160"/>
             <w:vAlign w:val="center"/>
           </w:tcPr>
           <w:p>
@@ -2230,13 +2316,13 @@
               <w:rPr>
                 <w:b w:val="0"/>
               </w:rPr>
-              <w:t>Low</w:t>
+              <w:t>$1.10 to $2.20. Up to $3 if people stay 6 months.</w:t>
             </w:r>
           </w:p>
         </w:tc>
         <w:tc>
           <w:tcPr>
-            <w:tcW w:type="dxa" w:w="2304"/>
+            <w:tcW w:type="dxa" w:w="2160"/>
             <w:vAlign w:val="center"/>
           </w:tcPr>
           <w:p>
@@ -2248,13 +2334,13 @@
               <w:rPr>
                 <w:b w:val="0"/>
               </w:rPr>
-              <w:t>High</w:t>
+              <w:t>$1.40 to $2.20. More if people stay.</w:t>
             </w:r>
           </w:p>
         </w:tc>
         <w:tc>
           <w:tcPr>
-            <w:tcW w:type="dxa" w:w="2304"/>
+            <w:tcW w:type="dxa" w:w="2160"/>
             <w:vAlign w:val="center"/>
           </w:tcPr>
           <w:p>
@@ -2266,7 +2352,7 @@
               <w:rPr>
                 <w:b w:val="0"/>
               </w:rPr>
-              <w:t>Low</w:t>
+              <w:t>very high on email sales, but fewer of them</w:t>
             </w:r>
           </w:p>
         </w:tc>
@@ -2274,7 +2360,7 @@
       <w:tr>
         <w:tc>
           <w:tcPr>
-            <w:tcW w:type="dxa" w:w="2736"/>
+            <w:tcW w:type="dxa" w:w="3168"/>
             <w:vAlign w:val="center"/>
           </w:tcPr>
           <w:p>
@@ -2286,13 +2372,13 @@
               <w:rPr>
                 <w:b/>
               </w:rPr>
-              <w:t>Best for</w:t>
+              <w:t>What we risk</w:t>
             </w:r>
           </w:p>
         </w:tc>
         <w:tc>
           <w:tcPr>
-            <w:tcW w:type="dxa" w:w="2304"/>
+            <w:tcW w:type="dxa" w:w="2160"/>
             <w:vAlign w:val="center"/>
           </w:tcPr>
           <w:p>
@@ -2304,13 +2390,13 @@
               <w:rPr>
                 <w:b w:val="0"/>
               </w:rPr>
-              <w:t>steady, safe growth</w:t>
+              <w:t>very little. Profit from the first order.</w:t>
             </w:r>
           </w:p>
         </w:tc>
         <w:tc>
           <w:tcPr>
-            <w:tcW w:type="dxa" w:w="2304"/>
+            <w:tcW w:type="dxa" w:w="2160"/>
             <w:vAlign w:val="center"/>
           </w:tcPr>
           <w:p>
@@ -2322,13 +2408,13 @@
               <w:rPr>
                 <w:b w:val="0"/>
               </w:rPr>
-              <w:t>a lot of emails fast</w:t>
+              <w:t>free boxes, refunds, and the ad money spent</w:t>
             </w:r>
           </w:p>
         </w:tc>
         <w:tc>
           <w:tcPr>
-            <w:tcW w:type="dxa" w:w="2304"/>
+            <w:tcW w:type="dxa" w:w="2160"/>
             <w:vAlign w:val="center"/>
           </w:tcPr>
           <w:p>
@@ -2340,7 +2426,81 @@
               <w:rPr>
                 <w:b w:val="0"/>
               </w:rPr>
-              <w:t>emails with no discount</w:t>
+              <w:t>build time and cost</w:t>
+            </w:r>
+          </w:p>
+        </w:tc>
+      </w:tr>
+      <w:tr>
+        <w:tc>
+          <w:tcPr>
+            <w:tcW w:type="dxa" w:w="3168"/>
+            <w:vAlign w:val="center"/>
+          </w:tcPr>
+          <w:p>
+            <w:pPr>
+              <w:spacing w:after="40" w:before="40"/>
+            </w:pPr>
+            <w:r/>
+            <w:r>
+              <w:rPr>
+                <w:b/>
+              </w:rPr>
+              <w:t>What we could win</w:t>
+            </w:r>
+          </w:p>
+        </w:tc>
+        <w:tc>
+          <w:tcPr>
+            <w:tcW w:type="dxa" w:w="2160"/>
+            <w:vAlign w:val="center"/>
+          </w:tcPr>
+          <w:p>
+            <w:pPr>
+              <w:spacing w:after="40" w:before="40"/>
+            </w:pPr>
+            <w:r/>
+            <w:r>
+              <w:rPr>
+                <w:b w:val="0"/>
+              </w:rPr>
+              <w:t>the list back, plus profitable growth</w:t>
+            </w:r>
+          </w:p>
+        </w:tc>
+        <w:tc>
+          <w:tcPr>
+            <w:tcW w:type="dxa" w:w="2160"/>
+            <w:vAlign w:val="center"/>
+          </w:tcPr>
+          <w:p>
+            <w:pPr>
+              <w:spacing w:after="40" w:before="40"/>
+            </w:pPr>
+            <w:r/>
+            <w:r>
+              <w:rPr>
+                <w:b w:val="0"/>
+              </w:rPr>
+              <w:t>the biggest list and the cheapest customers</w:t>
+            </w:r>
+          </w:p>
+        </w:tc>
+        <w:tc>
+          <w:tcPr>
+            <w:tcW w:type="dxa" w:w="2160"/>
+            <w:vAlign w:val="center"/>
+          </w:tcPr>
+          <w:p>
+            <w:pPr>
+              <w:spacing w:after="40" w:before="40"/>
+            </w:pPr>
+            <w:r/>
+            <w:r>
+              <w:rPr>
+                <w:b w:val="0"/>
+              </w:rPr>
+              <w:t>steady emails with no discount given away</w:t>
             </w:r>
           </w:p>
         </w:tc>
@@ -2356,34 +2516,43 @@
           <w:color w:val="1F2A37"/>
           <w:sz w:val="29"/>
         </w:rPr>
-        <w:t>What we should do</w:t>
+        <w:t>How to read the risk vs reward</w:t>
       </w:r>
     </w:p>
     <w:p>
       <w:pPr>
-        <w:pStyle w:val="ListNumber"/>
-        <w:spacing w:after="60"/>
+        <w:pStyle w:val="ListBullet"/>
+        <w:spacing w:after="40"/>
       </w:pPr>
       <w:r>
-        <w:t>Start the Comeback Deal now. Low risk. It makes money on the first order. It rebuilds the email list.</w:t>
+        <w:rPr>
+          <w:sz w:val="22"/>
+        </w:rPr>
+        <w:t>The Comeback Deal is low risk with a solid reward. It makes money from the very first order. Start it now.</w:t>
       </w:r>
     </w:p>
     <w:p>
       <w:pPr>
-        <w:pStyle w:val="ListNumber"/>
-        <w:spacing w:after="60"/>
+        <w:pStyle w:val="ListBullet"/>
+        <w:spacing w:after="40"/>
       </w:pPr>
       <w:r>
-        <w:t>Test the $1 Trial on its own landing page with a small paid ads budget. Watch the cost per customer, how many keep the box on day 21, and refunds. Grow it only if those numbers work.</w:t>
+        <w:rPr>
+          <w:sz w:val="22"/>
+        </w:rPr>
+        <w:t>The $1 Trial is high risk with the biggest reward. If the test works, it grows the list 7 to 12 times faster and gives us the cheapest customers we have ever had. If it fails, we lose free boxes and a small ad budget. So we test it small, on its own page, where we control it.</w:t>
       </w:r>
     </w:p>
     <w:p>
       <w:pPr>
-        <w:pStyle w:val="ListNumber"/>
-        <w:spacing w:after="60"/>
+        <w:pStyle w:val="ListBullet"/>
+        <w:spacing w:after="40"/>
       </w:pPr>
       <w:r>
-        <w:t>Start building the quiz now, since it takes the longest. Test it when it is ready.</w:t>
+        <w:rPr>
+          <w:sz w:val="22"/>
+        </w:rPr>
+        <w:t>The Quiz is low risk with a slower reward. It gives away no discount and fits the brand, but it sells nothing directly and must be built first. Build it in the background.</w:t>
       </w:r>
     </w:p>
     <w:p>
@@ -2488,6 +2657,32 @@
           <w:sz w:val="20"/>
         </w:rPr>
         <w:t>The quiz is not built yet. The 5 to 10 out of 100 number is what quizzes typically do compared to plain pop ups.</w:t>
+      </w:r>
+    </w:p>
+    <w:p>
+      <w:pPr>
+        <w:pStyle w:val="ListBullet"/>
+        <w:spacing w:after="40"/>
+      </w:pPr>
+      <w:r>
+        <w:rPr>
+          <w:color w:val="6B7178"/>
+          <w:sz w:val="20"/>
+        </w:rPr>
+        <w:t>Buyers per 100 visitors today: about 1.2. Typical stores like ours get 2.5 to 3.5. A stronger offer moves us toward typical, and that is what brings the ad cost down.</w:t>
+      </w:r>
+    </w:p>
+    <w:p>
+      <w:pPr>
+        <w:pStyle w:val="ListBullet"/>
+        <w:spacing w:after="40"/>
+      </w:pPr>
+      <w:r>
+        <w:rPr>
+          <w:color w:val="6B7178"/>
+          <w:sz w:val="20"/>
+        </w:rPr>
+        <w:t>Money back per $1 of ads means: what a customer is worth to us, divided by what they cost in ads.</w:t>
       </w:r>
     </w:p>
     <w:p>

</xml_diff>

<commit_message>
Raise Comeback Deal opt-in target to 10-15 out of 100 (keep 6 as proven floor)
</commit_message>
<xml_diff>
--- a/Numin-Acquisition-Offer-Proposal.docx
+++ b/Numin-Acquisition-Offer-Proposal.docx
@@ -648,7 +648,7 @@
               <w:rPr>
                 <w:b/>
               </w:rPr>
-              <w:t>about 6 out of 100 visitors</w:t>
+              <w:t>about 10 to 15 out of 100 (we got 6 before)</w:t>
             </w:r>
           </w:p>
         </w:tc>
@@ -686,7 +686,7 @@
               <w:rPr>
                 <w:b/>
               </w:rPr>
-              <w:t>about 650 to 910</w:t>
+              <w:t>about 1,300 to 1,950</w:t>
             </w:r>
           </w:p>
         </w:tc>
@@ -1946,7 +1946,7 @@
               <w:rPr>
                 <w:b w:val="0"/>
               </w:rPr>
-              <w:t>about 6</w:t>
+              <w:t>10 to 15</w:t>
             </w:r>
           </w:p>
         </w:tc>
@@ -2020,7 +2020,7 @@
               <w:rPr>
                 <w:b w:val="0"/>
               </w:rPr>
-              <w:t>650 to 910</w:t>
+              <w:t>1,300 to 1,950</w:t>
             </w:r>
           </w:p>
         </w:tc>
@@ -2094,7 +2094,7 @@
               <w:rPr>
                 <w:b w:val="0"/>
               </w:rPr>
-              <w:t>about 2 times today</w:t>
+              <w:t>about 4 to 6 times today</w:t>
             </w:r>
           </w:p>
         </w:tc>
@@ -2168,7 +2168,7 @@
               <w:rPr>
                 <w:b w:val="0"/>
               </w:rPr>
-              <w:t>about 2</w:t>
+              <w:t>about 2 to 3</w:t>
             </w:r>
           </w:p>
         </w:tc>
@@ -2528,7 +2528,7 @@
         <w:rPr>
           <w:sz w:val="22"/>
         </w:rPr>
-        <w:t>The Comeback Deal is low risk with a solid reward. It makes money from the very first order. Start it now.</w:t>
+        <w:t>The Comeback Deal is low risk with a solid reward. It makes money from the very first order, and it could grow the list 4 to 6 times faster than today. Start it now.</w:t>
       </w:r>
     </w:p>
     <w:p>
@@ -2630,7 +2630,7 @@
           <w:color w:val="6B7178"/>
           <w:sz w:val="20"/>
         </w:rPr>
-        <w:t>The Comeback Deal got about 6 out of 100 sign ups when we ran it here before.</w:t>
+        <w:t>The Comeback Deal got about 6 out of 100 sign ups when we ran a weaker version here before. With the stronger 40 percent off framing, 10 to 15 out of 100 is the target. This is the first thing we run, so we will know the real number fast.</w:t>
       </w:r>
     </w:p>
     <w:p>

</xml_diff>